<commit_message>
Uploaded executed finalized test cases
</commit_message>
<xml_diff>
--- a/test/Test Case finalized.docx
+++ b/test/Test Case finalized.docx
@@ -1213,7 +1213,7 @@
                 <w:lang w:eastAsia="en-GB"/>
               </w:rPr>
               <w:drawing>
-                <wp:inline distT="0" distB="0" distL="0" distR="0" wp14:anchorId="3528898A" wp14:editId="187BD34C">
+                <wp:inline distT="0" distB="0" distL="0" distR="0" wp14:anchorId="3528898A" wp14:editId="25E543C2">
                   <wp:extent cx="3853815" cy="2523281"/>
                   <wp:effectExtent l="0" t="0" r="0" b="0"/>
                   <wp:docPr id="1148829894" name="Picture 2" descr="A screenshot of a computer&#10;&#10;AI-generated content may be incorrect."/>
@@ -3647,7 +3647,7 @@
                 <w:lang w:eastAsia="en-GB"/>
               </w:rPr>
               <w:drawing>
-                <wp:inline distT="0" distB="0" distL="0" distR="0" wp14:anchorId="52AEA51E" wp14:editId="78536C81">
+                <wp:inline distT="0" distB="0" distL="0" distR="0" wp14:anchorId="52AEA51E" wp14:editId="577E5DE7">
                   <wp:extent cx="5278055" cy="1897874"/>
                   <wp:effectExtent l="0" t="0" r="0" b="0"/>
                   <wp:docPr id="706570242" name="Picture 8" descr="A screenshot of a computer&#10;&#10;AI-generated content may be incorrect."/>
@@ -4459,7 +4459,7 @@
                 <w:lang w:eastAsia="en-GB"/>
               </w:rPr>
               <w:drawing>
-                <wp:inline distT="0" distB="0" distL="0" distR="0" wp14:anchorId="07D980D2" wp14:editId="0A8CBC95">
+                <wp:inline distT="0" distB="0" distL="0" distR="0" wp14:anchorId="07D980D2" wp14:editId="111E6E69">
                   <wp:extent cx="2626995" cy="1909823"/>
                   <wp:effectExtent l="0" t="0" r="1905" b="0"/>
                   <wp:docPr id="436916058" name="Picture 11" descr="A screenshot of a computer screen&#10;&#10;AI-generated content may be incorrect."/>
@@ -14962,6 +14962,3295 @@
                           <a:xfrm>
                             <a:off x="0" y="0"/>
                             <a:ext cx="1752600" cy="1879600"/>
+                          </a:xfrm>
+                          <a:prstGeom prst="rect">
+                            <a:avLst/>
+                          </a:prstGeom>
+                        </pic:spPr>
+                      </pic:pic>
+                    </a:graphicData>
+                  </a:graphic>
+                </wp:inline>
+              </w:drawing>
+            </w:r>
+          </w:p>
+        </w:tc>
+      </w:tr>
+      <w:tr>
+        <w:tc>
+          <w:tcPr>
+            <w:tcW w:w="912" w:type="dxa"/>
+          </w:tcPr>
+          <w:p>
+            <w:pPr>
+              <w:cnfStyle w:val="001000000000" w:firstRow="0" w:lastRow="0" w:firstColumn="1" w:lastColumn="0" w:oddVBand="0" w:evenVBand="0" w:oddHBand="0" w:evenHBand="0" w:firstRowFirstColumn="0" w:firstRowLastColumn="0" w:lastRowFirstColumn="0" w:lastRowLastColumn="0"/>
+              <w:rPr>
+                <w:rFonts w:ascii="Times New Roman" w:eastAsia="Times New Roman" w:hAnsi="Times New Roman" w:cs="Times New Roman"/>
+                <w:kern w:val="0"/>
+                <w:szCs w:val="24"/>
+                <w:lang w:eastAsia="en-GB"/>
+                <w14:ligatures w14:val="none"/>
+              </w:rPr>
+            </w:pPr>
+            <w:r>
+              <w:rPr>
+                <w:rFonts w:ascii="Times New Roman" w:hAnsi="Times New Roman" w:cs="Times New Roman"/>
+              </w:rPr>
+              <w:t>TC037</w:t>
+            </w:r>
+          </w:p>
+        </w:tc>
+        <w:tc>
+          <w:tcPr>
+            <w:tcW w:w="1853" w:type="dxa"/>
+          </w:tcPr>
+          <w:p>
+            <w:pPr>
+              <w:rPr>
+                <w:rFonts w:ascii="Times New Roman" w:eastAsia="Times New Roman" w:hAnsi="Times New Roman" w:cs="Times New Roman"/>
+                <w:kern w:val="0"/>
+                <w:szCs w:val="24"/>
+                <w:lang w:eastAsia="en-GB"/>
+                <w14:ligatures w14:val="none"/>
+              </w:rPr>
+            </w:pPr>
+            <w:r>
+              <w:rPr>
+                <w:rFonts w:ascii="Times New Roman" w:hAnsi="Times New Roman" w:cs="Times New Roman"/>
+              </w:rPr>
+              <w:t>Manage Skills</w:t>
+            </w:r>
+          </w:p>
+        </w:tc>
+        <w:tc>
+          <w:tcPr>
+            <w:tcW w:w="2846" w:type="dxa"/>
+          </w:tcPr>
+          <w:p>
+            <w:pPr>
+              <w:rPr>
+                <w:rFonts w:ascii="Times New Roman" w:eastAsia="Times New Roman" w:hAnsi="Times New Roman" w:cs="Times New Roman"/>
+                <w:kern w:val="0"/>
+                <w:szCs w:val="24"/>
+                <w:lang w:eastAsia="en-GB"/>
+                <w14:ligatures w14:val="none"/>
+              </w:rPr>
+            </w:pPr>
+            <w:r>
+              <w:rPr>
+                <w:rFonts w:ascii="Times New Roman" w:hAnsi="Times New Roman" w:cs="Times New Roman"/>
+              </w:rPr>
+              <w:t>User logged in</w:t>
+            </w:r>
+          </w:p>
+        </w:tc>
+        <w:tc>
+          <w:tcPr>
+            <w:tcW w:w="2416" w:type="dxa"/>
+          </w:tcPr>
+          <w:p>
+            <w:pPr>
+              <w:rPr>
+                <w:rFonts w:ascii="Times New Roman" w:eastAsia="Times New Roman" w:hAnsi="Times New Roman" w:cs="Times New Roman"/>
+                <w:kern w:val="0"/>
+                <w:szCs w:val="24"/>
+                <w:lang w:eastAsia="en-GB"/>
+                <w14:ligatures w14:val="none"/>
+              </w:rPr>
+            </w:pPr>
+            <w:r>
+              <w:rPr>
+                <w:rFonts w:ascii="Times New Roman" w:hAnsi="Times New Roman" w:cs="Times New Roman"/>
+              </w:rPr>
+              <w:t>Navigate to Skills page → Add/Edit/Delete a skill → Save changes</w:t>
+            </w:r>
+          </w:p>
+        </w:tc>
+        <w:tc>
+          <w:tcPr>
+            <w:tcW w:w="2163" w:type="dxa"/>
+          </w:tcPr>
+          <w:p>
+            <w:pPr>
+              <w:rPr>
+                <w:rFonts w:ascii="Times New Roman" w:eastAsia="Times New Roman" w:hAnsi="Times New Roman" w:cs="Times New Roman"/>
+                <w:kern w:val="0"/>
+                <w:szCs w:val="24"/>
+                <w:lang w:eastAsia="en-GB"/>
+                <w14:ligatures w14:val="none"/>
+              </w:rPr>
+            </w:pPr>
+            <w:r>
+              <w:rPr>
+                <w:rFonts w:ascii="Times New Roman" w:hAnsi="Times New Roman" w:cs="Times New Roman"/>
+              </w:rPr>
+              <w:t>Skill name: “Java”</w:t>
+            </w:r>
+          </w:p>
+        </w:tc>
+        <w:tc>
+          <w:tcPr>
+            <w:tcW w:w="1508" w:type="dxa"/>
+          </w:tcPr>
+          <w:tbl>
+            <w:tblPr>
+              <w:tblW w:w="0" w:type="auto"/>
+              <w:tblCellSpacing w:w="15" w:type="dxa"/>
+              <w:tblCellMar>
+                <w:top w:w="15" w:type="dxa"/>
+                <w:left w:w="15" w:type="dxa"/>
+                <w:bottom w:w="15" w:type="dxa"/>
+                <w:right w:w="15" w:type="dxa"/>
+              </w:tblCellMar>
+              <w:tblLook w:val="04A0" w:firstRow="1" w:lastRow="0" w:firstColumn="1" w:lastColumn="0" w:noHBand="0" w:noVBand="1"/>
+            </w:tblPr>
+            <w:tblGrid>
+              <w:gridCol w:w="110"/>
+            </w:tblGrid>
+            <w:tr>
+              <w:trPr>
+                <w:tblCellSpacing w:w="15" w:type="dxa"/>
+              </w:trPr>
+              <w:tc>
+                <w:tcPr>
+                  <w:tcW w:w="36" w:type="dxa"/>
+                  <w:vAlign w:val="center"/>
+                  <w:hideMark/>
+                </w:tcPr>
+                <w:p>
+                  <w:pPr>
+                    <w:rPr>
+                      <w:rFonts w:ascii="Times New Roman" w:hAnsi="Times New Roman" w:cs="Times New Roman"/>
+                    </w:rPr>
+                  </w:pPr>
+                </w:p>
+              </w:tc>
+            </w:tr>
+          </w:tbl>
+          <w:p>
+            <w:pPr>
+              <w:rPr>
+                <w:rFonts w:ascii="Times New Roman" w:hAnsi="Times New Roman" w:cs="Times New Roman"/>
+                <w:vanish/>
+              </w:rPr>
+            </w:pPr>
+          </w:p>
+          <w:tbl>
+            <w:tblPr>
+              <w:tblW w:w="0" w:type="auto"/>
+              <w:tblCellSpacing w:w="15" w:type="dxa"/>
+              <w:tblCellMar>
+                <w:top w:w="15" w:type="dxa"/>
+                <w:left w:w="15" w:type="dxa"/>
+                <w:bottom w:w="15" w:type="dxa"/>
+                <w:right w:w="15" w:type="dxa"/>
+              </w:tblCellMar>
+              <w:tblLook w:val="04A0" w:firstRow="1" w:lastRow="0" w:firstColumn="1" w:lastColumn="0" w:noHBand="0" w:noVBand="1"/>
+            </w:tblPr>
+            <w:tblGrid>
+              <w:gridCol w:w="3823"/>
+            </w:tblGrid>
+            <w:tr>
+              <w:trPr>
+                <w:tblCellSpacing w:w="15" w:type="dxa"/>
+              </w:trPr>
+              <w:tc>
+                <w:tcPr>
+                  <w:tcW w:w="3763" w:type="dxa"/>
+                  <w:vAlign w:val="center"/>
+                  <w:hideMark/>
+                </w:tcPr>
+                <w:p>
+                  <w:pPr>
+                    <w:rPr>
+                      <w:rFonts w:ascii="Times New Roman" w:hAnsi="Times New Roman" w:cs="Times New Roman"/>
+                      <w:szCs w:val="24"/>
+                    </w:rPr>
+                  </w:pPr>
+                  <w:r>
+                    <w:rPr>
+                      <w:rFonts w:ascii="Times New Roman" w:hAnsi="Times New Roman" w:cs="Times New Roman"/>
+                    </w:rPr>
+                    <w:t>Skill added/edited/deleted successfully</w:t>
+                  </w:r>
+                </w:p>
+              </w:tc>
+            </w:tr>
+          </w:tbl>
+          <w:p>
+            <w:pPr>
+              <w:rPr>
+                <w:rFonts w:ascii="Times New Roman" w:eastAsia="Times New Roman" w:hAnsi="Times New Roman" w:cs="Times New Roman"/>
+                <w:kern w:val="0"/>
+                <w:szCs w:val="24"/>
+                <w:lang w:eastAsia="en-GB"/>
+                <w14:ligatures w14:val="none"/>
+              </w:rPr>
+            </w:pPr>
+          </w:p>
+        </w:tc>
+        <w:tc>
+          <w:tcPr>
+            <w:tcW w:w="1508" w:type="dxa"/>
+          </w:tcPr>
+          <w:p>
+            <w:pPr>
+              <w:rPr>
+                <w:rFonts w:ascii="Times New Roman" w:eastAsia="Times New Roman" w:hAnsi="Times New Roman" w:cs="Times New Roman"/>
+                <w:kern w:val="0"/>
+                <w:szCs w:val="24"/>
+                <w:lang w:eastAsia="en-GB"/>
+                <w14:ligatures w14:val="none"/>
+              </w:rPr>
+            </w:pPr>
+            <w:r>
+              <w:rPr>
+                <w:rFonts w:ascii="Times New Roman" w:hAnsi="Times New Roman" w:cs="Times New Roman"/>
+              </w:rPr>
+              <w:t>Skill added/edited/deleted successfully</w:t>
+            </w:r>
+          </w:p>
+        </w:tc>
+        <w:tc>
+          <w:tcPr>
+            <w:tcW w:w="857" w:type="dxa"/>
+          </w:tcPr>
+          <w:p>
+            <w:pPr>
+              <w:rPr>
+                <w:rFonts w:ascii="Times New Roman" w:eastAsia="Times New Roman" w:hAnsi="Times New Roman" w:cs="Times New Roman"/>
+                <w:kern w:val="0"/>
+                <w:szCs w:val="24"/>
+                <w:lang w:eastAsia="en-GB"/>
+                <w14:ligatures w14:val="none"/>
+              </w:rPr>
+            </w:pPr>
+            <w:r>
+              <w:rPr>
+                <w:rFonts w:ascii="Times New Roman" w:eastAsia="Times New Roman" w:hAnsi="Times New Roman" w:cs="Times New Roman"/>
+                <w:kern w:val="0"/>
+                <w:szCs w:val="24"/>
+                <w:lang w:eastAsia="en-GB"/>
+                <w14:ligatures w14:val="none"/>
+              </w:rPr>
+              <w:t>Pass</w:t>
+            </w:r>
+          </w:p>
+        </w:tc>
+        <w:tc>
+          <w:tcPr>
+            <w:tcW w:w="1096" w:type="dxa"/>
+          </w:tcPr>
+          <w:p>
+            <w:pPr>
+              <w:rPr>
+                <w:rFonts w:ascii="Times New Roman" w:eastAsia="Times New Roman" w:hAnsi="Times New Roman" w:cs="Times New Roman"/>
+                <w:kern w:val="0"/>
+                <w:szCs w:val="24"/>
+                <w:lang w:eastAsia="en-GB"/>
+                <w14:ligatures w14:val="none"/>
+              </w:rPr>
+            </w:pPr>
+            <w:r>
+              <w:rPr>
+                <w:rFonts w:ascii="Times New Roman" w:eastAsia="Times New Roman" w:hAnsi="Times New Roman" w:cs="Times New Roman"/>
+                <w:kern w:val="0"/>
+                <w:szCs w:val="24"/>
+                <w:lang w:eastAsia="en-GB"/>
+                <w14:ligatures w14:val="none"/>
+              </w:rPr>
+              <w:t>Zubayer</w:t>
+            </w:r>
+          </w:p>
+        </w:tc>
+        <w:tc>
+          <w:tcPr>
+            <w:tcW w:w="1123" w:type="dxa"/>
+          </w:tcPr>
+          <w:p>
+            <w:pPr>
+              <w:rPr>
+                <w:rFonts w:ascii="Times New Roman" w:eastAsia="Times New Roman" w:hAnsi="Times New Roman" w:cs="Times New Roman"/>
+                <w:kern w:val="0"/>
+                <w:szCs w:val="24"/>
+                <w:lang w:eastAsia="en-GB"/>
+                <w14:ligatures w14:val="none"/>
+              </w:rPr>
+            </w:pPr>
+            <w:r>
+              <w:rPr>
+                <w:rFonts w:ascii="Times New Roman" w:eastAsia="Times New Roman" w:hAnsi="Times New Roman" w:cs="Times New Roman"/>
+                <w:kern w:val="0"/>
+                <w:szCs w:val="24"/>
+                <w:lang w:eastAsia="en-GB"/>
+                <w14:ligatures w14:val="none"/>
+              </w:rPr>
+              <w:t>12-Mar-2026</w:t>
+            </w:r>
+          </w:p>
+        </w:tc>
+        <w:tc>
+          <w:tcPr>
+            <w:tcW w:w="1163" w:type="dxa"/>
+          </w:tcPr>
+          <w:p>
+            <w:pPr>
+              <w:rPr>
+                <w:rFonts w:ascii="Times New Roman" w:eastAsia="Times New Roman" w:hAnsi="Times New Roman" w:cs="Times New Roman"/>
+                <w:kern w:val="0"/>
+                <w:szCs w:val="24"/>
+                <w:lang w:eastAsia="en-GB"/>
+                <w14:ligatures w14:val="none"/>
+              </w:rPr>
+            </w:pPr>
+            <w:r>
+              <w:rPr>
+                <w:rFonts w:ascii="Times New Roman" w:eastAsia="Times New Roman" w:hAnsi="Times New Roman" w:cs="Times New Roman"/>
+                <w:kern w:val="0"/>
+                <w:szCs w:val="24"/>
+                <w:lang w:eastAsia="en-GB"/>
+                <w14:ligatures w14:val="none"/>
+              </w:rPr>
+              <w:t xml:space="preserve">Zubayer </w:t>
+            </w:r>
+          </w:p>
+        </w:tc>
+        <w:tc>
+          <w:tcPr>
+            <w:tcW w:w="1243" w:type="dxa"/>
+          </w:tcPr>
+          <w:p>
+            <w:pPr>
+              <w:rPr>
+                <w:rFonts w:ascii="Times New Roman" w:eastAsia="Times New Roman" w:hAnsi="Times New Roman" w:cs="Times New Roman"/>
+                <w:kern w:val="0"/>
+                <w:szCs w:val="24"/>
+                <w:lang w:eastAsia="en-GB"/>
+                <w14:ligatures w14:val="none"/>
+              </w:rPr>
+            </w:pPr>
+            <w:r>
+              <w:rPr>
+                <w:rFonts w:ascii="Times New Roman" w:eastAsia="Times New Roman" w:hAnsi="Times New Roman" w:cs="Times New Roman"/>
+                <w:kern w:val="0"/>
+                <w:szCs w:val="24"/>
+                <w:lang w:eastAsia="en-GB"/>
+                <w14:ligatures w14:val="none"/>
+              </w:rPr>
+              <w:t>12-Mar-2026</w:t>
+            </w:r>
+          </w:p>
+        </w:tc>
+        <w:tc>
+          <w:tcPr>
+            <w:tcW w:w="9156" w:type="dxa"/>
+          </w:tcPr>
+          <w:p>
+            <w:pPr>
+              <w:jc w:val="center"/>
+              <w:rPr>
+                <w:rFonts w:ascii="Times New Roman" w:eastAsia="Times New Roman" w:hAnsi="Times New Roman" w:cs="Times New Roman"/>
+                <w:noProof/>
+                <w:kern w:val="0"/>
+                <w:szCs w:val="24"/>
+                <w:lang w:eastAsia="en-GB"/>
+              </w:rPr>
+            </w:pPr>
+            <w:r>
+              <w:rPr>
+                <w:rFonts w:ascii="Times New Roman" w:eastAsia="Times New Roman" w:hAnsi="Times New Roman" w:cs="Times New Roman"/>
+                <w:noProof/>
+                <w:kern w:val="0"/>
+                <w:szCs w:val="24"/>
+                <w:lang w:eastAsia="en-GB"/>
+              </w:rPr>
+              <w:drawing>
+                <wp:inline distT="0" distB="0" distL="0" distR="0" wp14:anchorId="4D6B5189" wp14:editId="6DC88F8D">
+                  <wp:extent cx="5651500" cy="3060700"/>
+                  <wp:effectExtent l="0" t="0" r="0" b="0"/>
+                  <wp:docPr id="1588253657" name="Picture 1" descr="A screenshot of a computer&#10;&#10;AI-generated content may be incorrect."/>
+                  <wp:cNvGraphicFramePr>
+                    <a:graphicFrameLocks xmlns:a="http://schemas.openxmlformats.org/drawingml/2006/main" noChangeAspect="1"/>
+                  </wp:cNvGraphicFramePr>
+                  <a:graphic xmlns:a="http://schemas.openxmlformats.org/drawingml/2006/main">
+                    <a:graphicData uri="http://schemas.openxmlformats.org/drawingml/2006/picture">
+                      <pic:pic xmlns:pic="http://schemas.openxmlformats.org/drawingml/2006/picture">
+                        <pic:nvPicPr>
+                          <pic:cNvPr id="1588253657" name="Picture 1" descr="A screenshot of a computer&#10;&#10;AI-generated content may be incorrect."/>
+                          <pic:cNvPicPr/>
+                        </pic:nvPicPr>
+                        <pic:blipFill>
+                          <a:blip r:embed="rId34">
+                            <a:extLst>
+                              <a:ext uri="{28A0092B-C50C-407E-A947-70E740481C1C}">
+                                <a14:useLocalDpi xmlns:a14="http://schemas.microsoft.com/office/drawing/2010/main" val="0"/>
+                              </a:ext>
+                            </a:extLst>
+                          </a:blip>
+                          <a:stretch>
+                            <a:fillRect/>
+                          </a:stretch>
+                        </pic:blipFill>
+                        <pic:spPr>
+                          <a:xfrm>
+                            <a:off x="0" y="0"/>
+                            <a:ext cx="5651500" cy="3060700"/>
+                          </a:xfrm>
+                          <a:prstGeom prst="rect">
+                            <a:avLst/>
+                          </a:prstGeom>
+                        </pic:spPr>
+                      </pic:pic>
+                    </a:graphicData>
+                  </a:graphic>
+                </wp:inline>
+              </w:drawing>
+            </w:r>
+          </w:p>
+        </w:tc>
+      </w:tr>
+      <w:tr>
+        <w:tc>
+          <w:tcPr>
+            <w:cnfStyle w:val="001000000000" w:firstRow="0" w:lastRow="0" w:firstColumn="1" w:lastColumn="0" w:oddVBand="0" w:evenVBand="0" w:oddHBand="0" w:evenHBand="0" w:firstRowFirstColumn="0" w:firstRowLastColumn="0" w:lastRowFirstColumn="0" w:lastRowLastColumn="0"/>
+            <w:tcW w:w="912" w:type="dxa"/>
+          </w:tcPr>
+          <w:p>
+            <w:pPr>
+              <w:rPr>
+                <w:rFonts w:ascii="Times New Roman" w:hAnsi="Times New Roman" w:cs="Times New Roman"/>
+              </w:rPr>
+            </w:pPr>
+            <w:r>
+              <w:rPr>
+                <w:rFonts w:ascii="Times New Roman" w:hAnsi="Times New Roman" w:cs="Times New Roman"/>
+              </w:rPr>
+              <w:t>TC038</w:t>
+            </w:r>
+          </w:p>
+        </w:tc>
+        <w:tc>
+          <w:tcPr>
+            <w:tcW w:w="1853" w:type="dxa"/>
+          </w:tcPr>
+          <w:p>
+            <w:pPr>
+              <w:cnfStyle w:val="000000000000" w:firstRow="0" w:lastRow="0" w:firstColumn="0" w:lastColumn="0" w:oddVBand="0" w:evenVBand="0" w:oddHBand="0" w:evenHBand="0" w:firstRowFirstColumn="0" w:firstRowLastColumn="0" w:lastRowFirstColumn="0" w:lastRowLastColumn="0"/>
+              <w:rPr>
+                <w:rFonts w:ascii="Times New Roman" w:hAnsi="Times New Roman" w:cs="Times New Roman"/>
+              </w:rPr>
+            </w:pPr>
+            <w:r>
+              <w:rPr>
+                <w:rFonts w:ascii="Times New Roman" w:hAnsi="Times New Roman" w:cs="Times New Roman"/>
+              </w:rPr>
+              <w:t>Manage Goals</w:t>
+            </w:r>
+          </w:p>
+        </w:tc>
+        <w:tc>
+          <w:tcPr>
+            <w:tcW w:w="2846" w:type="dxa"/>
+          </w:tcPr>
+          <w:p>
+            <w:pPr>
+              <w:cnfStyle w:val="000000000000" w:firstRow="0" w:lastRow="0" w:firstColumn="0" w:lastColumn="0" w:oddVBand="0" w:evenVBand="0" w:oddHBand="0" w:evenHBand="0" w:firstRowFirstColumn="0" w:firstRowLastColumn="0" w:lastRowFirstColumn="0" w:lastRowLastColumn="0"/>
+              <w:rPr>
+                <w:rFonts w:ascii="Times New Roman" w:hAnsi="Times New Roman" w:cs="Times New Roman"/>
+              </w:rPr>
+            </w:pPr>
+            <w:r>
+              <w:rPr>
+                <w:rFonts w:ascii="Times New Roman" w:hAnsi="Times New Roman" w:cs="Times New Roman"/>
+              </w:rPr>
+              <w:t>u</w:t>
+            </w:r>
+            <w:r>
+              <w:rPr>
+                <w:rFonts w:ascii="Times New Roman" w:hAnsi="Times New Roman" w:cs="Times New Roman"/>
+              </w:rPr>
+              <w:t>ser logged in</w:t>
+            </w:r>
+          </w:p>
+        </w:tc>
+        <w:tc>
+          <w:tcPr>
+            <w:tcW w:w="2416" w:type="dxa"/>
+          </w:tcPr>
+          <w:p>
+            <w:pPr>
+              <w:cnfStyle w:val="000000000000" w:firstRow="0" w:lastRow="0" w:firstColumn="0" w:lastColumn="0" w:oddVBand="0" w:evenVBand="0" w:oddHBand="0" w:evenHBand="0" w:firstRowFirstColumn="0" w:firstRowLastColumn="0" w:lastRowFirstColumn="0" w:lastRowLastColumn="0"/>
+              <w:rPr>
+                <w:rFonts w:ascii="Times New Roman" w:hAnsi="Times New Roman" w:cs="Times New Roman"/>
+              </w:rPr>
+            </w:pPr>
+            <w:r>
+              <w:rPr>
+                <w:rFonts w:ascii="Times New Roman" w:hAnsi="Times New Roman" w:cs="Times New Roman"/>
+              </w:rPr>
+              <w:t>Navigate to Goals page → Add/Edit/Delete a goal → Save changes</w:t>
+            </w:r>
+          </w:p>
+        </w:tc>
+        <w:tc>
+          <w:tcPr>
+            <w:tcW w:w="2163" w:type="dxa"/>
+          </w:tcPr>
+          <w:p>
+            <w:pPr>
+              <w:cnfStyle w:val="000000000000" w:firstRow="0" w:lastRow="0" w:firstColumn="0" w:lastColumn="0" w:oddVBand="0" w:evenVBand="0" w:oddHBand="0" w:evenHBand="0" w:firstRowFirstColumn="0" w:firstRowLastColumn="0" w:lastRowFirstColumn="0" w:lastRowLastColumn="0"/>
+              <w:rPr>
+                <w:rFonts w:ascii="Times New Roman" w:hAnsi="Times New Roman" w:cs="Times New Roman"/>
+              </w:rPr>
+            </w:pPr>
+            <w:r>
+              <w:rPr>
+                <w:rFonts w:ascii="Times New Roman" w:hAnsi="Times New Roman" w:cs="Times New Roman"/>
+              </w:rPr>
+              <w:t>Goal name: “Learn Python”, Category: “Learning”</w:t>
+            </w:r>
+          </w:p>
+        </w:tc>
+        <w:tc>
+          <w:tcPr>
+            <w:tcW w:w="1508" w:type="dxa"/>
+          </w:tcPr>
+          <w:p>
+            <w:pPr>
+              <w:cnfStyle w:val="000000000000" w:firstRow="0" w:lastRow="0" w:firstColumn="0" w:lastColumn="0" w:oddVBand="0" w:evenVBand="0" w:oddHBand="0" w:evenHBand="0" w:firstRowFirstColumn="0" w:firstRowLastColumn="0" w:lastRowFirstColumn="0" w:lastRowLastColumn="0"/>
+              <w:rPr>
+                <w:rFonts w:ascii="Times New Roman" w:hAnsi="Times New Roman" w:cs="Times New Roman"/>
+              </w:rPr>
+            </w:pPr>
+            <w:r>
+              <w:rPr>
+                <w:rFonts w:ascii="Times New Roman" w:hAnsi="Times New Roman" w:cs="Times New Roman"/>
+              </w:rPr>
+              <w:t>Goal added/edited/deleted successfully</w:t>
+            </w:r>
+          </w:p>
+        </w:tc>
+        <w:tc>
+          <w:tcPr>
+            <w:tcW w:w="1508" w:type="dxa"/>
+          </w:tcPr>
+          <w:p>
+            <w:pPr>
+              <w:cnfStyle w:val="000000000000" w:firstRow="0" w:lastRow="0" w:firstColumn="0" w:lastColumn="0" w:oddVBand="0" w:evenVBand="0" w:oddHBand="0" w:evenHBand="0" w:firstRowFirstColumn="0" w:firstRowLastColumn="0" w:lastRowFirstColumn="0" w:lastRowLastColumn="0"/>
+              <w:rPr>
+                <w:rFonts w:ascii="Times New Roman" w:hAnsi="Times New Roman" w:cs="Times New Roman"/>
+              </w:rPr>
+            </w:pPr>
+            <w:r>
+              <w:rPr>
+                <w:rFonts w:ascii="Times New Roman" w:hAnsi="Times New Roman" w:cs="Times New Roman"/>
+              </w:rPr>
+              <w:t>Goal added/edited/deleted successfully</w:t>
+            </w:r>
+          </w:p>
+        </w:tc>
+        <w:tc>
+          <w:tcPr>
+            <w:tcW w:w="857" w:type="dxa"/>
+          </w:tcPr>
+          <w:p>
+            <w:pPr>
+              <w:cnfStyle w:val="000000000000" w:firstRow="0" w:lastRow="0" w:firstColumn="0" w:lastColumn="0" w:oddVBand="0" w:evenVBand="0" w:oddHBand="0" w:evenHBand="0" w:firstRowFirstColumn="0" w:firstRowLastColumn="0" w:lastRowFirstColumn="0" w:lastRowLastColumn="0"/>
+              <w:rPr>
+                <w:rFonts w:ascii="Times New Roman" w:eastAsia="Times New Roman" w:hAnsi="Times New Roman" w:cs="Times New Roman"/>
+                <w:kern w:val="0"/>
+                <w:szCs w:val="24"/>
+                <w:lang w:eastAsia="en-GB"/>
+                <w14:ligatures w14:val="none"/>
+              </w:rPr>
+            </w:pPr>
+            <w:r>
+              <w:rPr>
+                <w:rFonts w:ascii="Times New Roman" w:eastAsia="Times New Roman" w:hAnsi="Times New Roman" w:cs="Times New Roman"/>
+                <w:kern w:val="0"/>
+                <w:szCs w:val="24"/>
+                <w:lang w:eastAsia="en-GB"/>
+                <w14:ligatures w14:val="none"/>
+              </w:rPr>
+              <w:t>Pass</w:t>
+            </w:r>
+          </w:p>
+        </w:tc>
+        <w:tc>
+          <w:tcPr>
+            <w:tcW w:w="1096" w:type="dxa"/>
+          </w:tcPr>
+          <w:p>
+            <w:pPr>
+              <w:cnfStyle w:val="000000000000" w:firstRow="0" w:lastRow="0" w:firstColumn="0" w:lastColumn="0" w:oddVBand="0" w:evenVBand="0" w:oddHBand="0" w:evenHBand="0" w:firstRowFirstColumn="0" w:firstRowLastColumn="0" w:lastRowFirstColumn="0" w:lastRowLastColumn="0"/>
+              <w:rPr>
+                <w:rFonts w:ascii="Times New Roman" w:eastAsia="Times New Roman" w:hAnsi="Times New Roman" w:cs="Times New Roman"/>
+                <w:kern w:val="0"/>
+                <w:szCs w:val="24"/>
+                <w:lang w:eastAsia="en-GB"/>
+                <w14:ligatures w14:val="none"/>
+              </w:rPr>
+            </w:pPr>
+            <w:r>
+              <w:rPr>
+                <w:rFonts w:ascii="Times New Roman" w:eastAsia="Times New Roman" w:hAnsi="Times New Roman" w:cs="Times New Roman"/>
+                <w:kern w:val="0"/>
+                <w:szCs w:val="24"/>
+                <w:lang w:eastAsia="en-GB"/>
+                <w14:ligatures w14:val="none"/>
+              </w:rPr>
+              <w:t xml:space="preserve">Zubayer </w:t>
+            </w:r>
+          </w:p>
+        </w:tc>
+        <w:tc>
+          <w:tcPr>
+            <w:tcW w:w="1123" w:type="dxa"/>
+          </w:tcPr>
+          <w:p>
+            <w:pPr>
+              <w:cnfStyle w:val="000000000000" w:firstRow="0" w:lastRow="0" w:firstColumn="0" w:lastColumn="0" w:oddVBand="0" w:evenVBand="0" w:oddHBand="0" w:evenHBand="0" w:firstRowFirstColumn="0" w:firstRowLastColumn="0" w:lastRowFirstColumn="0" w:lastRowLastColumn="0"/>
+              <w:rPr>
+                <w:rFonts w:ascii="Times New Roman" w:eastAsia="Times New Roman" w:hAnsi="Times New Roman" w:cs="Times New Roman"/>
+                <w:kern w:val="0"/>
+                <w:szCs w:val="24"/>
+                <w:lang w:eastAsia="en-GB"/>
+                <w14:ligatures w14:val="none"/>
+              </w:rPr>
+            </w:pPr>
+            <w:r>
+              <w:rPr>
+                <w:rFonts w:ascii="Times New Roman" w:eastAsia="Times New Roman" w:hAnsi="Times New Roman" w:cs="Times New Roman"/>
+                <w:kern w:val="0"/>
+                <w:szCs w:val="24"/>
+                <w:lang w:eastAsia="en-GB"/>
+                <w14:ligatures w14:val="none"/>
+              </w:rPr>
+              <w:t>12-Mar-2026</w:t>
+            </w:r>
+          </w:p>
+        </w:tc>
+        <w:tc>
+          <w:tcPr>
+            <w:tcW w:w="1163" w:type="dxa"/>
+          </w:tcPr>
+          <w:p>
+            <w:pPr>
+              <w:cnfStyle w:val="000000000000" w:firstRow="0" w:lastRow="0" w:firstColumn="0" w:lastColumn="0" w:oddVBand="0" w:evenVBand="0" w:oddHBand="0" w:evenHBand="0" w:firstRowFirstColumn="0" w:firstRowLastColumn="0" w:lastRowFirstColumn="0" w:lastRowLastColumn="0"/>
+              <w:rPr>
+                <w:rFonts w:ascii="Times New Roman" w:eastAsia="Times New Roman" w:hAnsi="Times New Roman" w:cs="Times New Roman"/>
+                <w:kern w:val="0"/>
+                <w:szCs w:val="24"/>
+                <w:lang w:eastAsia="en-GB"/>
+                <w14:ligatures w14:val="none"/>
+              </w:rPr>
+            </w:pPr>
+            <w:r>
+              <w:rPr>
+                <w:rFonts w:ascii="Times New Roman" w:eastAsia="Times New Roman" w:hAnsi="Times New Roman" w:cs="Times New Roman"/>
+                <w:kern w:val="0"/>
+                <w:szCs w:val="24"/>
+                <w:lang w:eastAsia="en-GB"/>
+                <w14:ligatures w14:val="none"/>
+              </w:rPr>
+              <w:t>Zubayer</w:t>
+            </w:r>
+          </w:p>
+        </w:tc>
+        <w:tc>
+          <w:tcPr>
+            <w:tcW w:w="1243" w:type="dxa"/>
+          </w:tcPr>
+          <w:p>
+            <w:pPr>
+              <w:cnfStyle w:val="000000000000" w:firstRow="0" w:lastRow="0" w:firstColumn="0" w:lastColumn="0" w:oddVBand="0" w:evenVBand="0" w:oddHBand="0" w:evenHBand="0" w:firstRowFirstColumn="0" w:firstRowLastColumn="0" w:lastRowFirstColumn="0" w:lastRowLastColumn="0"/>
+              <w:rPr>
+                <w:rFonts w:ascii="Times New Roman" w:eastAsia="Times New Roman" w:hAnsi="Times New Roman" w:cs="Times New Roman"/>
+                <w:kern w:val="0"/>
+                <w:szCs w:val="24"/>
+                <w:lang w:eastAsia="en-GB"/>
+                <w14:ligatures w14:val="none"/>
+              </w:rPr>
+            </w:pPr>
+            <w:r>
+              <w:rPr>
+                <w:rFonts w:ascii="Times New Roman" w:eastAsia="Times New Roman" w:hAnsi="Times New Roman" w:cs="Times New Roman"/>
+                <w:kern w:val="0"/>
+                <w:szCs w:val="24"/>
+                <w:lang w:eastAsia="en-GB"/>
+                <w14:ligatures w14:val="none"/>
+              </w:rPr>
+              <w:t>12-Mar-2026</w:t>
+            </w:r>
+          </w:p>
+        </w:tc>
+        <w:tc>
+          <w:tcPr>
+            <w:tcW w:w="9156" w:type="dxa"/>
+          </w:tcPr>
+          <w:p>
+            <w:pPr>
+              <w:jc w:val="center"/>
+              <w:cnfStyle w:val="000000000000" w:firstRow="0" w:lastRow="0" w:firstColumn="0" w:lastColumn="0" w:oddVBand="0" w:evenVBand="0" w:oddHBand="0" w:evenHBand="0" w:firstRowFirstColumn="0" w:firstRowLastColumn="0" w:lastRowFirstColumn="0" w:lastRowLastColumn="0"/>
+              <w:rPr>
+                <w:rFonts w:ascii="Times New Roman" w:eastAsia="Times New Roman" w:hAnsi="Times New Roman" w:cs="Times New Roman"/>
+                <w:noProof/>
+                <w:kern w:val="0"/>
+                <w:szCs w:val="24"/>
+                <w:lang w:eastAsia="en-GB"/>
+              </w:rPr>
+            </w:pPr>
+            <w:r>
+              <w:rPr>
+                <w:rFonts w:ascii="Times New Roman" w:eastAsia="Times New Roman" w:hAnsi="Times New Roman" w:cs="Times New Roman"/>
+                <w:noProof/>
+                <w:kern w:val="0"/>
+                <w:szCs w:val="24"/>
+                <w:lang w:eastAsia="en-GB"/>
+              </w:rPr>
+              <w:drawing>
+                <wp:inline distT="0" distB="0" distL="0" distR="0" wp14:anchorId="30BAD6AC" wp14:editId="763C5512">
+                  <wp:extent cx="2578100" cy="1524000"/>
+                  <wp:effectExtent l="0" t="0" r="0" b="0"/>
+                  <wp:docPr id="916347707" name="Picture 2" descr="A screenshot of a survey&#10;&#10;AI-generated content may be incorrect."/>
+                  <wp:cNvGraphicFramePr>
+                    <a:graphicFrameLocks xmlns:a="http://schemas.openxmlformats.org/drawingml/2006/main" noChangeAspect="1"/>
+                  </wp:cNvGraphicFramePr>
+                  <a:graphic xmlns:a="http://schemas.openxmlformats.org/drawingml/2006/main">
+                    <a:graphicData uri="http://schemas.openxmlformats.org/drawingml/2006/picture">
+                      <pic:pic xmlns:pic="http://schemas.openxmlformats.org/drawingml/2006/picture">
+                        <pic:nvPicPr>
+                          <pic:cNvPr id="916347707" name="Picture 2" descr="A screenshot of a survey&#10;&#10;AI-generated content may be incorrect."/>
+                          <pic:cNvPicPr/>
+                        </pic:nvPicPr>
+                        <pic:blipFill>
+                          <a:blip r:embed="rId35">
+                            <a:extLst>
+                              <a:ext uri="{28A0092B-C50C-407E-A947-70E740481C1C}">
+                                <a14:useLocalDpi xmlns:a14="http://schemas.microsoft.com/office/drawing/2010/main" val="0"/>
+                              </a:ext>
+                            </a:extLst>
+                          </a:blip>
+                          <a:stretch>
+                            <a:fillRect/>
+                          </a:stretch>
+                        </pic:blipFill>
+                        <pic:spPr>
+                          <a:xfrm>
+                            <a:off x="0" y="0"/>
+                            <a:ext cx="2578100" cy="1524000"/>
+                          </a:xfrm>
+                          <a:prstGeom prst="rect">
+                            <a:avLst/>
+                          </a:prstGeom>
+                        </pic:spPr>
+                      </pic:pic>
+                    </a:graphicData>
+                  </a:graphic>
+                </wp:inline>
+              </w:drawing>
+            </w:r>
+          </w:p>
+        </w:tc>
+      </w:tr>
+      <w:tr>
+        <w:tc>
+          <w:tcPr>
+            <w:cnfStyle w:val="001000000000" w:firstRow="0" w:lastRow="0" w:firstColumn="1" w:lastColumn="0" w:oddVBand="0" w:evenVBand="0" w:oddHBand="0" w:evenHBand="0" w:firstRowFirstColumn="0" w:firstRowLastColumn="0" w:lastRowFirstColumn="0" w:lastRowLastColumn="0"/>
+            <w:tcW w:w="912" w:type="dxa"/>
+          </w:tcPr>
+          <w:p>
+            <w:pPr>
+              <w:rPr>
+                <w:rFonts w:ascii="Times New Roman" w:hAnsi="Times New Roman" w:cs="Times New Roman"/>
+              </w:rPr>
+            </w:pPr>
+            <w:r>
+              <w:rPr>
+                <w:rFonts w:ascii="Times New Roman" w:hAnsi="Times New Roman" w:cs="Times New Roman"/>
+              </w:rPr>
+              <w:t>TC039</w:t>
+            </w:r>
+          </w:p>
+        </w:tc>
+        <w:tc>
+          <w:tcPr>
+            <w:tcW w:w="1853" w:type="dxa"/>
+          </w:tcPr>
+          <w:tbl>
+            <w:tblPr>
+              <w:tblW w:w="0" w:type="auto"/>
+              <w:tblCellSpacing w:w="15" w:type="dxa"/>
+              <w:tblCellMar>
+                <w:top w:w="15" w:type="dxa"/>
+                <w:left w:w="15" w:type="dxa"/>
+                <w:bottom w:w="15" w:type="dxa"/>
+                <w:right w:w="15" w:type="dxa"/>
+              </w:tblCellMar>
+              <w:tblLook w:val="04A0" w:firstRow="1" w:lastRow="0" w:firstColumn="1" w:lastColumn="0" w:noHBand="0" w:noVBand="1"/>
+            </w:tblPr>
+            <w:tblGrid>
+              <w:gridCol w:w="110"/>
+            </w:tblGrid>
+            <w:tr>
+              <w:trPr>
+                <w:tblCellSpacing w:w="15" w:type="dxa"/>
+              </w:trPr>
+              <w:tc>
+                <w:tcPr>
+                  <w:tcW w:w="36" w:type="dxa"/>
+                  <w:vAlign w:val="center"/>
+                  <w:hideMark/>
+                </w:tcPr>
+                <w:p>
+                  <w:pPr>
+                    <w:rPr>
+                      <w:rFonts w:ascii="Times New Roman" w:hAnsi="Times New Roman" w:cs="Times New Roman"/>
+                    </w:rPr>
+                  </w:pPr>
+                </w:p>
+              </w:tc>
+            </w:tr>
+          </w:tbl>
+          <w:p>
+            <w:pPr>
+              <w:cnfStyle w:val="000000000000" w:firstRow="0" w:lastRow="0" w:firstColumn="0" w:lastColumn="0" w:oddVBand="0" w:evenVBand="0" w:oddHBand="0" w:evenHBand="0" w:firstRowFirstColumn="0" w:firstRowLastColumn="0" w:lastRowFirstColumn="0" w:lastRowLastColumn="0"/>
+              <w:rPr>
+                <w:rFonts w:ascii="Times New Roman" w:hAnsi="Times New Roman" w:cs="Times New Roman"/>
+                <w:vanish/>
+              </w:rPr>
+            </w:pPr>
+          </w:p>
+          <w:tbl>
+            <w:tblPr>
+              <w:tblW w:w="0" w:type="auto"/>
+              <w:tblCellSpacing w:w="15" w:type="dxa"/>
+              <w:tblCellMar>
+                <w:top w:w="15" w:type="dxa"/>
+                <w:left w:w="15" w:type="dxa"/>
+                <w:bottom w:w="15" w:type="dxa"/>
+                <w:right w:w="15" w:type="dxa"/>
+              </w:tblCellMar>
+              <w:tblLook w:val="04A0" w:firstRow="1" w:lastRow="0" w:firstColumn="1" w:lastColumn="0" w:noHBand="0" w:noVBand="1"/>
+            </w:tblPr>
+            <w:tblGrid>
+              <w:gridCol w:w="1770"/>
+            </w:tblGrid>
+            <w:tr>
+              <w:trPr>
+                <w:tblCellSpacing w:w="15" w:type="dxa"/>
+              </w:trPr>
+              <w:tc>
+                <w:tcPr>
+                  <w:tcW w:w="1710" w:type="dxa"/>
+                  <w:vAlign w:val="center"/>
+                  <w:hideMark/>
+                </w:tcPr>
+                <w:p>
+                  <w:pPr>
+                    <w:rPr>
+                      <w:rFonts w:ascii="Times New Roman" w:hAnsi="Times New Roman" w:cs="Times New Roman"/>
+                      <w:szCs w:val="24"/>
+                    </w:rPr>
+                  </w:pPr>
+                  <w:r>
+                    <w:rPr>
+                      <w:rFonts w:ascii="Times New Roman" w:hAnsi="Times New Roman" w:cs="Times New Roman"/>
+                    </w:rPr>
+                    <w:t>Enter Goal Name</w:t>
+                  </w:r>
+                </w:p>
+              </w:tc>
+            </w:tr>
+          </w:tbl>
+          <w:p>
+            <w:pPr>
+              <w:cnfStyle w:val="000000000000" w:firstRow="0" w:lastRow="0" w:firstColumn="0" w:lastColumn="0" w:oddVBand="0" w:evenVBand="0" w:oddHBand="0" w:evenHBand="0" w:firstRowFirstColumn="0" w:firstRowLastColumn="0" w:lastRowFirstColumn="0" w:lastRowLastColumn="0"/>
+              <w:rPr>
+                <w:rFonts w:ascii="Times New Roman" w:hAnsi="Times New Roman" w:cs="Times New Roman"/>
+              </w:rPr>
+            </w:pPr>
+          </w:p>
+        </w:tc>
+        <w:tc>
+          <w:tcPr>
+            <w:tcW w:w="2846" w:type="dxa"/>
+          </w:tcPr>
+          <w:p>
+            <w:pPr>
+              <w:cnfStyle w:val="000000000000" w:firstRow="0" w:lastRow="0" w:firstColumn="0" w:lastColumn="0" w:oddVBand="0" w:evenVBand="0" w:oddHBand="0" w:evenHBand="0" w:firstRowFirstColumn="0" w:firstRowLastColumn="0" w:lastRowFirstColumn="0" w:lastRowLastColumn="0"/>
+              <w:rPr>
+                <w:rFonts w:ascii="Times New Roman" w:hAnsi="Times New Roman" w:cs="Times New Roman"/>
+              </w:rPr>
+            </w:pPr>
+            <w:r>
+              <w:rPr>
+                <w:rFonts w:ascii="Times New Roman" w:hAnsi="Times New Roman" w:cs="Times New Roman"/>
+              </w:rPr>
+              <w:t xml:space="preserve">User on </w:t>
+            </w:r>
+            <w:r>
+              <w:rPr>
+                <w:rFonts w:ascii="Times New Roman" w:hAnsi="Times New Roman" w:cs="Times New Roman"/>
+              </w:rPr>
+              <w:t>Set</w:t>
+            </w:r>
+            <w:r>
+              <w:rPr>
+                <w:rFonts w:ascii="Times New Roman" w:hAnsi="Times New Roman" w:cs="Times New Roman"/>
+              </w:rPr>
+              <w:t xml:space="preserve"> Goal page</w:t>
+            </w:r>
+          </w:p>
+        </w:tc>
+        <w:tc>
+          <w:tcPr>
+            <w:tcW w:w="2416" w:type="dxa"/>
+          </w:tcPr>
+          <w:p>
+            <w:pPr>
+              <w:cnfStyle w:val="000000000000" w:firstRow="0" w:lastRow="0" w:firstColumn="0" w:lastColumn="0" w:oddVBand="0" w:evenVBand="0" w:oddHBand="0" w:evenHBand="0" w:firstRowFirstColumn="0" w:firstRowLastColumn="0" w:lastRowFirstColumn="0" w:lastRowLastColumn="0"/>
+              <w:rPr>
+                <w:rFonts w:ascii="Times New Roman" w:hAnsi="Times New Roman" w:cs="Times New Roman"/>
+              </w:rPr>
+            </w:pPr>
+            <w:r>
+              <w:rPr>
+                <w:rFonts w:ascii="Times New Roman" w:hAnsi="Times New Roman" w:cs="Times New Roman"/>
+              </w:rPr>
+              <w:t>Click “</w:t>
+            </w:r>
+            <w:r>
+              <w:rPr>
+                <w:rFonts w:ascii="Times New Roman" w:hAnsi="Times New Roman" w:cs="Times New Roman"/>
+              </w:rPr>
+              <w:t xml:space="preserve">Set </w:t>
+            </w:r>
+            <w:r>
+              <w:rPr>
+                <w:rFonts w:ascii="Times New Roman" w:hAnsi="Times New Roman" w:cs="Times New Roman"/>
+              </w:rPr>
+              <w:t xml:space="preserve"> Goal” → Enter goal name → Save</w:t>
+            </w:r>
+          </w:p>
+        </w:tc>
+        <w:tc>
+          <w:tcPr>
+            <w:tcW w:w="2163" w:type="dxa"/>
+          </w:tcPr>
+          <w:p>
+            <w:pPr>
+              <w:cnfStyle w:val="000000000000" w:firstRow="0" w:lastRow="0" w:firstColumn="0" w:lastColumn="0" w:oddVBand="0" w:evenVBand="0" w:oddHBand="0" w:evenHBand="0" w:firstRowFirstColumn="0" w:firstRowLastColumn="0" w:lastRowFirstColumn="0" w:lastRowLastColumn="0"/>
+              <w:rPr>
+                <w:rFonts w:ascii="Times New Roman" w:hAnsi="Times New Roman" w:cs="Times New Roman"/>
+              </w:rPr>
+            </w:pPr>
+            <w:r>
+              <w:rPr>
+                <w:rFonts w:ascii="Times New Roman" w:hAnsi="Times New Roman" w:cs="Times New Roman"/>
+              </w:rPr>
+              <w:t>Goal name: “Build Portfolio”</w:t>
+            </w:r>
+          </w:p>
+        </w:tc>
+        <w:tc>
+          <w:tcPr>
+            <w:tcW w:w="1508" w:type="dxa"/>
+          </w:tcPr>
+          <w:p>
+            <w:pPr>
+              <w:cnfStyle w:val="000000000000" w:firstRow="0" w:lastRow="0" w:firstColumn="0" w:lastColumn="0" w:oddVBand="0" w:evenVBand="0" w:oddHBand="0" w:evenHBand="0" w:firstRowFirstColumn="0" w:firstRowLastColumn="0" w:lastRowFirstColumn="0" w:lastRowLastColumn="0"/>
+              <w:rPr>
+                <w:rFonts w:ascii="Times New Roman" w:hAnsi="Times New Roman" w:cs="Times New Roman"/>
+              </w:rPr>
+            </w:pPr>
+            <w:r>
+              <w:rPr>
+                <w:rFonts w:ascii="Times New Roman" w:hAnsi="Times New Roman" w:cs="Times New Roman"/>
+              </w:rPr>
+              <w:t xml:space="preserve">Goal name accepted and displayed in </w:t>
+            </w:r>
+            <w:r>
+              <w:rPr>
+                <w:rFonts w:ascii="Times New Roman" w:hAnsi="Times New Roman" w:cs="Times New Roman"/>
+              </w:rPr>
+              <w:t xml:space="preserve">Current </w:t>
+            </w:r>
+            <w:r>
+              <w:rPr>
+                <w:rFonts w:ascii="Times New Roman" w:hAnsi="Times New Roman" w:cs="Times New Roman"/>
+              </w:rPr>
+              <w:t>Goals list</w:t>
+            </w:r>
+          </w:p>
+        </w:tc>
+        <w:tc>
+          <w:tcPr>
+            <w:tcW w:w="1508" w:type="dxa"/>
+          </w:tcPr>
+          <w:p>
+            <w:pPr>
+              <w:cnfStyle w:val="000000000000" w:firstRow="0" w:lastRow="0" w:firstColumn="0" w:lastColumn="0" w:oddVBand="0" w:evenVBand="0" w:oddHBand="0" w:evenHBand="0" w:firstRowFirstColumn="0" w:firstRowLastColumn="0" w:lastRowFirstColumn="0" w:lastRowLastColumn="0"/>
+              <w:rPr>
+                <w:rFonts w:ascii="Times New Roman" w:hAnsi="Times New Roman" w:cs="Times New Roman"/>
+              </w:rPr>
+            </w:pPr>
+            <w:r>
+              <w:rPr>
+                <w:rFonts w:ascii="Times New Roman" w:hAnsi="Times New Roman" w:cs="Times New Roman"/>
+              </w:rPr>
+              <w:t>Goal name accepted and displayed in Current Goals list</w:t>
+            </w:r>
+          </w:p>
+        </w:tc>
+        <w:tc>
+          <w:tcPr>
+            <w:tcW w:w="857" w:type="dxa"/>
+          </w:tcPr>
+          <w:p>
+            <w:pPr>
+              <w:cnfStyle w:val="000000000000" w:firstRow="0" w:lastRow="0" w:firstColumn="0" w:lastColumn="0" w:oddVBand="0" w:evenVBand="0" w:oddHBand="0" w:evenHBand="0" w:firstRowFirstColumn="0" w:firstRowLastColumn="0" w:lastRowFirstColumn="0" w:lastRowLastColumn="0"/>
+              <w:rPr>
+                <w:rFonts w:ascii="Times New Roman" w:eastAsia="Times New Roman" w:hAnsi="Times New Roman" w:cs="Times New Roman"/>
+                <w:kern w:val="0"/>
+                <w:szCs w:val="24"/>
+                <w:lang w:eastAsia="en-GB"/>
+                <w14:ligatures w14:val="none"/>
+              </w:rPr>
+            </w:pPr>
+            <w:r>
+              <w:rPr>
+                <w:rFonts w:ascii="Times New Roman" w:eastAsia="Times New Roman" w:hAnsi="Times New Roman" w:cs="Times New Roman"/>
+                <w:kern w:val="0"/>
+                <w:szCs w:val="24"/>
+                <w:lang w:eastAsia="en-GB"/>
+                <w14:ligatures w14:val="none"/>
+              </w:rPr>
+              <w:t>Pass</w:t>
+            </w:r>
+          </w:p>
+        </w:tc>
+        <w:tc>
+          <w:tcPr>
+            <w:tcW w:w="1096" w:type="dxa"/>
+          </w:tcPr>
+          <w:p>
+            <w:pPr>
+              <w:cnfStyle w:val="000000000000" w:firstRow="0" w:lastRow="0" w:firstColumn="0" w:lastColumn="0" w:oddVBand="0" w:evenVBand="0" w:oddHBand="0" w:evenHBand="0" w:firstRowFirstColumn="0" w:firstRowLastColumn="0" w:lastRowFirstColumn="0" w:lastRowLastColumn="0"/>
+              <w:rPr>
+                <w:rFonts w:ascii="Times New Roman" w:eastAsia="Times New Roman" w:hAnsi="Times New Roman" w:cs="Times New Roman"/>
+                <w:kern w:val="0"/>
+                <w:szCs w:val="24"/>
+                <w:lang w:eastAsia="en-GB"/>
+                <w14:ligatures w14:val="none"/>
+              </w:rPr>
+            </w:pPr>
+            <w:r>
+              <w:rPr>
+                <w:rFonts w:ascii="Times New Roman" w:eastAsia="Times New Roman" w:hAnsi="Times New Roman" w:cs="Times New Roman"/>
+                <w:kern w:val="0"/>
+                <w:szCs w:val="24"/>
+                <w:lang w:eastAsia="en-GB"/>
+                <w14:ligatures w14:val="none"/>
+              </w:rPr>
+              <w:t>Zubayer</w:t>
+            </w:r>
+          </w:p>
+        </w:tc>
+        <w:tc>
+          <w:tcPr>
+            <w:tcW w:w="1123" w:type="dxa"/>
+          </w:tcPr>
+          <w:p>
+            <w:pPr>
+              <w:cnfStyle w:val="000000000000" w:firstRow="0" w:lastRow="0" w:firstColumn="0" w:lastColumn="0" w:oddVBand="0" w:evenVBand="0" w:oddHBand="0" w:evenHBand="0" w:firstRowFirstColumn="0" w:firstRowLastColumn="0" w:lastRowFirstColumn="0" w:lastRowLastColumn="0"/>
+              <w:rPr>
+                <w:rFonts w:ascii="Times New Roman" w:eastAsia="Times New Roman" w:hAnsi="Times New Roman" w:cs="Times New Roman"/>
+                <w:kern w:val="0"/>
+                <w:szCs w:val="24"/>
+                <w:lang w:eastAsia="en-GB"/>
+                <w14:ligatures w14:val="none"/>
+              </w:rPr>
+            </w:pPr>
+            <w:r>
+              <w:rPr>
+                <w:rFonts w:ascii="Times New Roman" w:eastAsia="Times New Roman" w:hAnsi="Times New Roman" w:cs="Times New Roman"/>
+                <w:kern w:val="0"/>
+                <w:szCs w:val="24"/>
+                <w:lang w:eastAsia="en-GB"/>
+                <w14:ligatures w14:val="none"/>
+              </w:rPr>
+              <w:t>12-Mar-2026</w:t>
+            </w:r>
+          </w:p>
+        </w:tc>
+        <w:tc>
+          <w:tcPr>
+            <w:tcW w:w="1163" w:type="dxa"/>
+          </w:tcPr>
+          <w:p>
+            <w:pPr>
+              <w:cnfStyle w:val="000000000000" w:firstRow="0" w:lastRow="0" w:firstColumn="0" w:lastColumn="0" w:oddVBand="0" w:evenVBand="0" w:oddHBand="0" w:evenHBand="0" w:firstRowFirstColumn="0" w:firstRowLastColumn="0" w:lastRowFirstColumn="0" w:lastRowLastColumn="0"/>
+              <w:rPr>
+                <w:rFonts w:ascii="Times New Roman" w:eastAsia="Times New Roman" w:hAnsi="Times New Roman" w:cs="Times New Roman"/>
+                <w:kern w:val="0"/>
+                <w:szCs w:val="24"/>
+                <w:lang w:eastAsia="en-GB"/>
+                <w14:ligatures w14:val="none"/>
+              </w:rPr>
+            </w:pPr>
+            <w:r>
+              <w:rPr>
+                <w:rFonts w:ascii="Times New Roman" w:eastAsia="Times New Roman" w:hAnsi="Times New Roman" w:cs="Times New Roman"/>
+                <w:kern w:val="0"/>
+                <w:szCs w:val="24"/>
+                <w:lang w:eastAsia="en-GB"/>
+                <w14:ligatures w14:val="none"/>
+              </w:rPr>
+              <w:t xml:space="preserve">Zubayer </w:t>
+            </w:r>
+          </w:p>
+        </w:tc>
+        <w:tc>
+          <w:tcPr>
+            <w:tcW w:w="1243" w:type="dxa"/>
+          </w:tcPr>
+          <w:p>
+            <w:pPr>
+              <w:cnfStyle w:val="000000000000" w:firstRow="0" w:lastRow="0" w:firstColumn="0" w:lastColumn="0" w:oddVBand="0" w:evenVBand="0" w:oddHBand="0" w:evenHBand="0" w:firstRowFirstColumn="0" w:firstRowLastColumn="0" w:lastRowFirstColumn="0" w:lastRowLastColumn="0"/>
+              <w:rPr>
+                <w:rFonts w:ascii="Times New Roman" w:eastAsia="Times New Roman" w:hAnsi="Times New Roman" w:cs="Times New Roman"/>
+                <w:kern w:val="0"/>
+                <w:szCs w:val="24"/>
+                <w:lang w:eastAsia="en-GB"/>
+                <w14:ligatures w14:val="none"/>
+              </w:rPr>
+            </w:pPr>
+            <w:r>
+              <w:rPr>
+                <w:rFonts w:ascii="Times New Roman" w:eastAsia="Times New Roman" w:hAnsi="Times New Roman" w:cs="Times New Roman"/>
+                <w:kern w:val="0"/>
+                <w:szCs w:val="24"/>
+                <w:lang w:eastAsia="en-GB"/>
+                <w14:ligatures w14:val="none"/>
+              </w:rPr>
+              <w:t>12-Mar-2026</w:t>
+            </w:r>
+          </w:p>
+        </w:tc>
+        <w:tc>
+          <w:tcPr>
+            <w:tcW w:w="9156" w:type="dxa"/>
+          </w:tcPr>
+          <w:p>
+            <w:pPr>
+              <w:jc w:val="center"/>
+              <w:cnfStyle w:val="000000000000" w:firstRow="0" w:lastRow="0" w:firstColumn="0" w:lastColumn="0" w:oddVBand="0" w:evenVBand="0" w:oddHBand="0" w:evenHBand="0" w:firstRowFirstColumn="0" w:firstRowLastColumn="0" w:lastRowFirstColumn="0" w:lastRowLastColumn="0"/>
+              <w:rPr>
+                <w:rFonts w:ascii="Times New Roman" w:eastAsia="Times New Roman" w:hAnsi="Times New Roman" w:cs="Times New Roman"/>
+                <w:noProof/>
+                <w:kern w:val="0"/>
+                <w:szCs w:val="24"/>
+                <w:lang w:eastAsia="en-GB"/>
+              </w:rPr>
+            </w:pPr>
+            <w:r>
+              <w:rPr>
+                <w:rFonts w:ascii="Times New Roman" w:eastAsia="Times New Roman" w:hAnsi="Times New Roman" w:cs="Times New Roman"/>
+                <w:noProof/>
+                <w:kern w:val="0"/>
+                <w:szCs w:val="24"/>
+                <w:lang w:eastAsia="en-GB"/>
+              </w:rPr>
+              <w:drawing>
+                <wp:inline distT="0" distB="0" distL="0" distR="0" wp14:anchorId="0B660FF4" wp14:editId="5ECA2EFC">
+                  <wp:extent cx="4394200" cy="2197100"/>
+                  <wp:effectExtent l="0" t="0" r="0" b="0"/>
+                  <wp:docPr id="1842616698" name="Picture 3" descr="A screenshot of a computer&#10;&#10;AI-generated content may be incorrect."/>
+                  <wp:cNvGraphicFramePr>
+                    <a:graphicFrameLocks xmlns:a="http://schemas.openxmlformats.org/drawingml/2006/main" noChangeAspect="1"/>
+                  </wp:cNvGraphicFramePr>
+                  <a:graphic xmlns:a="http://schemas.openxmlformats.org/drawingml/2006/main">
+                    <a:graphicData uri="http://schemas.openxmlformats.org/drawingml/2006/picture">
+                      <pic:pic xmlns:pic="http://schemas.openxmlformats.org/drawingml/2006/picture">
+                        <pic:nvPicPr>
+                          <pic:cNvPr id="1842616698" name="Picture 3" descr="A screenshot of a computer&#10;&#10;AI-generated content may be incorrect."/>
+                          <pic:cNvPicPr/>
+                        </pic:nvPicPr>
+                        <pic:blipFill>
+                          <a:blip r:embed="rId36">
+                            <a:extLst>
+                              <a:ext uri="{28A0092B-C50C-407E-A947-70E740481C1C}">
+                                <a14:useLocalDpi xmlns:a14="http://schemas.microsoft.com/office/drawing/2010/main" val="0"/>
+                              </a:ext>
+                            </a:extLst>
+                          </a:blip>
+                          <a:stretch>
+                            <a:fillRect/>
+                          </a:stretch>
+                        </pic:blipFill>
+                        <pic:spPr>
+                          <a:xfrm>
+                            <a:off x="0" y="0"/>
+                            <a:ext cx="4394200" cy="2197100"/>
+                          </a:xfrm>
+                          <a:prstGeom prst="rect">
+                            <a:avLst/>
+                          </a:prstGeom>
+                        </pic:spPr>
+                      </pic:pic>
+                    </a:graphicData>
+                  </a:graphic>
+                </wp:inline>
+              </w:drawing>
+            </w:r>
+          </w:p>
+        </w:tc>
+      </w:tr>
+      <w:tr>
+        <w:tc>
+          <w:tcPr>
+            <w:cnfStyle w:val="001000000000" w:firstRow="0" w:lastRow="0" w:firstColumn="1" w:lastColumn="0" w:oddVBand="0" w:evenVBand="0" w:oddHBand="0" w:evenHBand="0" w:firstRowFirstColumn="0" w:firstRowLastColumn="0" w:lastRowFirstColumn="0" w:lastRowLastColumn="0"/>
+            <w:tcW w:w="912" w:type="dxa"/>
+          </w:tcPr>
+          <w:p>
+            <w:pPr>
+              <w:rPr>
+                <w:rFonts w:ascii="Times New Roman" w:hAnsi="Times New Roman" w:cs="Times New Roman"/>
+              </w:rPr>
+            </w:pPr>
+            <w:r>
+              <w:rPr>
+                <w:rFonts w:ascii="Times New Roman" w:hAnsi="Times New Roman" w:cs="Times New Roman"/>
+              </w:rPr>
+              <w:t>TC040</w:t>
+            </w:r>
+          </w:p>
+        </w:tc>
+        <w:tc>
+          <w:tcPr>
+            <w:tcW w:w="1853" w:type="dxa"/>
+          </w:tcPr>
+          <w:p>
+            <w:pPr>
+              <w:cnfStyle w:val="000000000000" w:firstRow="0" w:lastRow="0" w:firstColumn="0" w:lastColumn="0" w:oddVBand="0" w:evenVBand="0" w:oddHBand="0" w:evenHBand="0" w:firstRowFirstColumn="0" w:firstRowLastColumn="0" w:lastRowFirstColumn="0" w:lastRowLastColumn="0"/>
+              <w:rPr>
+                <w:rFonts w:ascii="Times New Roman" w:hAnsi="Times New Roman" w:cs="Times New Roman"/>
+              </w:rPr>
+            </w:pPr>
+            <w:r>
+              <w:rPr>
+                <w:rFonts w:ascii="Times New Roman" w:hAnsi="Times New Roman" w:cs="Times New Roman"/>
+              </w:rPr>
+              <w:t>Enter Goal Category</w:t>
+            </w:r>
+          </w:p>
+        </w:tc>
+        <w:tc>
+          <w:tcPr>
+            <w:tcW w:w="2846" w:type="dxa"/>
+          </w:tcPr>
+          <w:p>
+            <w:pPr>
+              <w:cnfStyle w:val="000000000000" w:firstRow="0" w:lastRow="0" w:firstColumn="0" w:lastColumn="0" w:oddVBand="0" w:evenVBand="0" w:oddHBand="0" w:evenHBand="0" w:firstRowFirstColumn="0" w:firstRowLastColumn="0" w:lastRowFirstColumn="0" w:lastRowLastColumn="0"/>
+              <w:rPr>
+                <w:rFonts w:ascii="Times New Roman" w:hAnsi="Times New Roman" w:cs="Times New Roman"/>
+              </w:rPr>
+            </w:pPr>
+            <w:r>
+              <w:rPr>
+                <w:rFonts w:ascii="Times New Roman" w:hAnsi="Times New Roman" w:cs="Times New Roman"/>
+              </w:rPr>
+              <w:t xml:space="preserve">User on </w:t>
+            </w:r>
+            <w:r>
+              <w:rPr>
+                <w:rFonts w:ascii="Times New Roman" w:hAnsi="Times New Roman" w:cs="Times New Roman"/>
+              </w:rPr>
+              <w:t>Set</w:t>
+            </w:r>
+            <w:r>
+              <w:rPr>
+                <w:rFonts w:ascii="Times New Roman" w:hAnsi="Times New Roman" w:cs="Times New Roman"/>
+              </w:rPr>
+              <w:t xml:space="preserve"> Goal page</w:t>
+            </w:r>
+          </w:p>
+        </w:tc>
+        <w:tc>
+          <w:tcPr>
+            <w:tcW w:w="2416" w:type="dxa"/>
+          </w:tcPr>
+          <w:tbl>
+            <w:tblPr>
+              <w:tblW w:w="0" w:type="auto"/>
+              <w:tblCellSpacing w:w="15" w:type="dxa"/>
+              <w:tblCellMar>
+                <w:top w:w="15" w:type="dxa"/>
+                <w:left w:w="15" w:type="dxa"/>
+                <w:bottom w:w="15" w:type="dxa"/>
+                <w:right w:w="15" w:type="dxa"/>
+              </w:tblCellMar>
+              <w:tblLook w:val="04A0" w:firstRow="1" w:lastRow="0" w:firstColumn="1" w:lastColumn="0" w:noHBand="0" w:noVBand="1"/>
+            </w:tblPr>
+            <w:tblGrid>
+              <w:gridCol w:w="110"/>
+            </w:tblGrid>
+            <w:tr>
+              <w:trPr>
+                <w:tblCellSpacing w:w="15" w:type="dxa"/>
+              </w:trPr>
+              <w:tc>
+                <w:tcPr>
+                  <w:tcW w:w="36" w:type="dxa"/>
+                  <w:vAlign w:val="center"/>
+                  <w:hideMark/>
+                </w:tcPr>
+                <w:p>
+                  <w:pPr>
+                    <w:rPr>
+                      <w:rFonts w:ascii="Times New Roman" w:hAnsi="Times New Roman" w:cs="Times New Roman"/>
+                    </w:rPr>
+                  </w:pPr>
+                </w:p>
+              </w:tc>
+            </w:tr>
+          </w:tbl>
+          <w:p>
+            <w:pPr>
+              <w:cnfStyle w:val="000000000000" w:firstRow="0" w:lastRow="0" w:firstColumn="0" w:lastColumn="0" w:oddVBand="0" w:evenVBand="0" w:oddHBand="0" w:evenHBand="0" w:firstRowFirstColumn="0" w:firstRowLastColumn="0" w:lastRowFirstColumn="0" w:lastRowLastColumn="0"/>
+              <w:rPr>
+                <w:rFonts w:ascii="Times New Roman" w:hAnsi="Times New Roman" w:cs="Times New Roman"/>
+                <w:vanish/>
+              </w:rPr>
+            </w:pPr>
+          </w:p>
+          <w:tbl>
+            <w:tblPr>
+              <w:tblW w:w="0" w:type="auto"/>
+              <w:tblCellSpacing w:w="15" w:type="dxa"/>
+              <w:tblCellMar>
+                <w:top w:w="15" w:type="dxa"/>
+                <w:left w:w="15" w:type="dxa"/>
+                <w:bottom w:w="15" w:type="dxa"/>
+                <w:right w:w="15" w:type="dxa"/>
+              </w:tblCellMar>
+              <w:tblLook w:val="04A0" w:firstRow="1" w:lastRow="0" w:firstColumn="1" w:lastColumn="0" w:noHBand="0" w:noVBand="1"/>
+            </w:tblPr>
+            <w:tblGrid>
+              <w:gridCol w:w="4889"/>
+            </w:tblGrid>
+            <w:tr>
+              <w:trPr>
+                <w:tblCellSpacing w:w="15" w:type="dxa"/>
+              </w:trPr>
+              <w:tc>
+                <w:tcPr>
+                  <w:tcW w:w="4829" w:type="dxa"/>
+                  <w:vAlign w:val="center"/>
+                  <w:hideMark/>
+                </w:tcPr>
+                <w:p>
+                  <w:pPr>
+                    <w:rPr>
+                      <w:rFonts w:ascii="Times New Roman" w:hAnsi="Times New Roman" w:cs="Times New Roman"/>
+                      <w:szCs w:val="24"/>
+                    </w:rPr>
+                  </w:pPr>
+                  <w:r>
+                    <w:rPr>
+                      <w:rFonts w:ascii="Times New Roman" w:hAnsi="Times New Roman" w:cs="Times New Roman"/>
+                    </w:rPr>
+                    <w:t>Click “</w:t>
+                  </w:r>
+                  <w:r>
+                    <w:rPr>
+                      <w:rFonts w:ascii="Times New Roman" w:hAnsi="Times New Roman" w:cs="Times New Roman"/>
+                    </w:rPr>
+                    <w:t>Set</w:t>
+                  </w:r>
+                  <w:r>
+                    <w:rPr>
+                      <w:rFonts w:ascii="Times New Roman" w:hAnsi="Times New Roman" w:cs="Times New Roman"/>
+                    </w:rPr>
+                    <w:t xml:space="preserve"> Goal” → Enter goal category → Save</w:t>
+                  </w:r>
+                </w:p>
+              </w:tc>
+            </w:tr>
+          </w:tbl>
+          <w:p>
+            <w:pPr>
+              <w:cnfStyle w:val="000000000000" w:firstRow="0" w:lastRow="0" w:firstColumn="0" w:lastColumn="0" w:oddVBand="0" w:evenVBand="0" w:oddHBand="0" w:evenHBand="0" w:firstRowFirstColumn="0" w:firstRowLastColumn="0" w:lastRowFirstColumn="0" w:lastRowLastColumn="0"/>
+              <w:rPr>
+                <w:rFonts w:ascii="Times New Roman" w:hAnsi="Times New Roman" w:cs="Times New Roman"/>
+              </w:rPr>
+            </w:pPr>
+          </w:p>
+        </w:tc>
+        <w:tc>
+          <w:tcPr>
+            <w:tcW w:w="2163" w:type="dxa"/>
+          </w:tcPr>
+          <w:p>
+            <w:pPr>
+              <w:cnfStyle w:val="000000000000" w:firstRow="0" w:lastRow="0" w:firstColumn="0" w:lastColumn="0" w:oddVBand="0" w:evenVBand="0" w:oddHBand="0" w:evenHBand="0" w:firstRowFirstColumn="0" w:firstRowLastColumn="0" w:lastRowFirstColumn="0" w:lastRowLastColumn="0"/>
+              <w:rPr>
+                <w:rFonts w:ascii="Times New Roman" w:hAnsi="Times New Roman" w:cs="Times New Roman"/>
+              </w:rPr>
+            </w:pPr>
+            <w:r>
+              <w:rPr>
+                <w:rFonts w:ascii="Times New Roman" w:hAnsi="Times New Roman" w:cs="Times New Roman"/>
+              </w:rPr>
+              <w:t>Goal category: “Career”</w:t>
+            </w:r>
+          </w:p>
+        </w:tc>
+        <w:tc>
+          <w:tcPr>
+            <w:tcW w:w="1508" w:type="dxa"/>
+          </w:tcPr>
+          <w:p>
+            <w:pPr>
+              <w:cnfStyle w:val="000000000000" w:firstRow="0" w:lastRow="0" w:firstColumn="0" w:lastColumn="0" w:oddVBand="0" w:evenVBand="0" w:oddHBand="0" w:evenHBand="0" w:firstRowFirstColumn="0" w:firstRowLastColumn="0" w:lastRowFirstColumn="0" w:lastRowLastColumn="0"/>
+              <w:rPr>
+                <w:rFonts w:ascii="Times New Roman" w:hAnsi="Times New Roman" w:cs="Times New Roman"/>
+              </w:rPr>
+            </w:pPr>
+            <w:r>
+              <w:rPr>
+                <w:rFonts w:ascii="Times New Roman" w:hAnsi="Times New Roman" w:cs="Times New Roman"/>
+              </w:rPr>
+              <w:t>Goal category accepted and displayed correctly</w:t>
+            </w:r>
+          </w:p>
+        </w:tc>
+        <w:tc>
+          <w:tcPr>
+            <w:tcW w:w="1508" w:type="dxa"/>
+          </w:tcPr>
+          <w:p>
+            <w:pPr>
+              <w:cnfStyle w:val="000000000000" w:firstRow="0" w:lastRow="0" w:firstColumn="0" w:lastColumn="0" w:oddVBand="0" w:evenVBand="0" w:oddHBand="0" w:evenHBand="0" w:firstRowFirstColumn="0" w:firstRowLastColumn="0" w:lastRowFirstColumn="0" w:lastRowLastColumn="0"/>
+              <w:rPr>
+                <w:rFonts w:ascii="Times New Roman" w:hAnsi="Times New Roman" w:cs="Times New Roman"/>
+              </w:rPr>
+            </w:pPr>
+            <w:r>
+              <w:rPr>
+                <w:rFonts w:ascii="Times New Roman" w:hAnsi="Times New Roman" w:cs="Times New Roman"/>
+              </w:rPr>
+              <w:t>Goal category accepted and displayed correctly</w:t>
+            </w:r>
+          </w:p>
+        </w:tc>
+        <w:tc>
+          <w:tcPr>
+            <w:tcW w:w="857" w:type="dxa"/>
+          </w:tcPr>
+          <w:p>
+            <w:pPr>
+              <w:cnfStyle w:val="000000000000" w:firstRow="0" w:lastRow="0" w:firstColumn="0" w:lastColumn="0" w:oddVBand="0" w:evenVBand="0" w:oddHBand="0" w:evenHBand="0" w:firstRowFirstColumn="0" w:firstRowLastColumn="0" w:lastRowFirstColumn="0" w:lastRowLastColumn="0"/>
+              <w:rPr>
+                <w:rFonts w:ascii="Times New Roman" w:eastAsia="Times New Roman" w:hAnsi="Times New Roman" w:cs="Times New Roman"/>
+                <w:kern w:val="0"/>
+                <w:szCs w:val="24"/>
+                <w:lang w:eastAsia="en-GB"/>
+                <w14:ligatures w14:val="none"/>
+              </w:rPr>
+            </w:pPr>
+            <w:r>
+              <w:rPr>
+                <w:rFonts w:ascii="Times New Roman" w:eastAsia="Times New Roman" w:hAnsi="Times New Roman" w:cs="Times New Roman"/>
+                <w:kern w:val="0"/>
+                <w:szCs w:val="24"/>
+                <w:lang w:eastAsia="en-GB"/>
+                <w14:ligatures w14:val="none"/>
+              </w:rPr>
+              <w:t>Pass</w:t>
+            </w:r>
+          </w:p>
+        </w:tc>
+        <w:tc>
+          <w:tcPr>
+            <w:tcW w:w="1096" w:type="dxa"/>
+          </w:tcPr>
+          <w:p>
+            <w:pPr>
+              <w:cnfStyle w:val="000000000000" w:firstRow="0" w:lastRow="0" w:firstColumn="0" w:lastColumn="0" w:oddVBand="0" w:evenVBand="0" w:oddHBand="0" w:evenHBand="0" w:firstRowFirstColumn="0" w:firstRowLastColumn="0" w:lastRowFirstColumn="0" w:lastRowLastColumn="0"/>
+              <w:rPr>
+                <w:rFonts w:ascii="Times New Roman" w:eastAsia="Times New Roman" w:hAnsi="Times New Roman" w:cs="Times New Roman"/>
+                <w:kern w:val="0"/>
+                <w:szCs w:val="24"/>
+                <w:lang w:eastAsia="en-GB"/>
+                <w14:ligatures w14:val="none"/>
+              </w:rPr>
+            </w:pPr>
+            <w:r>
+              <w:rPr>
+                <w:rFonts w:ascii="Times New Roman" w:eastAsia="Times New Roman" w:hAnsi="Times New Roman" w:cs="Times New Roman"/>
+                <w:kern w:val="0"/>
+                <w:szCs w:val="24"/>
+                <w:lang w:eastAsia="en-GB"/>
+                <w14:ligatures w14:val="none"/>
+              </w:rPr>
+              <w:t>Zubayer</w:t>
+            </w:r>
+          </w:p>
+        </w:tc>
+        <w:tc>
+          <w:tcPr>
+            <w:tcW w:w="1123" w:type="dxa"/>
+          </w:tcPr>
+          <w:p>
+            <w:pPr>
+              <w:cnfStyle w:val="000000000000" w:firstRow="0" w:lastRow="0" w:firstColumn="0" w:lastColumn="0" w:oddVBand="0" w:evenVBand="0" w:oddHBand="0" w:evenHBand="0" w:firstRowFirstColumn="0" w:firstRowLastColumn="0" w:lastRowFirstColumn="0" w:lastRowLastColumn="0"/>
+              <w:rPr>
+                <w:rFonts w:ascii="Times New Roman" w:eastAsia="Times New Roman" w:hAnsi="Times New Roman" w:cs="Times New Roman"/>
+                <w:kern w:val="0"/>
+                <w:szCs w:val="24"/>
+                <w:lang w:eastAsia="en-GB"/>
+                <w14:ligatures w14:val="none"/>
+              </w:rPr>
+            </w:pPr>
+            <w:r>
+              <w:rPr>
+                <w:rFonts w:ascii="Times New Roman" w:eastAsia="Times New Roman" w:hAnsi="Times New Roman" w:cs="Times New Roman"/>
+                <w:kern w:val="0"/>
+                <w:szCs w:val="24"/>
+                <w:lang w:eastAsia="en-GB"/>
+                <w14:ligatures w14:val="none"/>
+              </w:rPr>
+              <w:t>12-Mar-2026</w:t>
+            </w:r>
+          </w:p>
+        </w:tc>
+        <w:tc>
+          <w:tcPr>
+            <w:tcW w:w="1163" w:type="dxa"/>
+          </w:tcPr>
+          <w:p>
+            <w:pPr>
+              <w:cnfStyle w:val="000000000000" w:firstRow="0" w:lastRow="0" w:firstColumn="0" w:lastColumn="0" w:oddVBand="0" w:evenVBand="0" w:oddHBand="0" w:evenHBand="0" w:firstRowFirstColumn="0" w:firstRowLastColumn="0" w:lastRowFirstColumn="0" w:lastRowLastColumn="0"/>
+              <w:rPr>
+                <w:rFonts w:ascii="Times New Roman" w:eastAsia="Times New Roman" w:hAnsi="Times New Roman" w:cs="Times New Roman"/>
+                <w:kern w:val="0"/>
+                <w:szCs w:val="24"/>
+                <w:lang w:eastAsia="en-GB"/>
+                <w14:ligatures w14:val="none"/>
+              </w:rPr>
+            </w:pPr>
+            <w:r>
+              <w:rPr>
+                <w:rFonts w:ascii="Times New Roman" w:eastAsia="Times New Roman" w:hAnsi="Times New Roman" w:cs="Times New Roman"/>
+                <w:kern w:val="0"/>
+                <w:szCs w:val="24"/>
+                <w:lang w:eastAsia="en-GB"/>
+                <w14:ligatures w14:val="none"/>
+              </w:rPr>
+              <w:t>Zubayer</w:t>
+            </w:r>
+          </w:p>
+        </w:tc>
+        <w:tc>
+          <w:tcPr>
+            <w:tcW w:w="1243" w:type="dxa"/>
+          </w:tcPr>
+          <w:p>
+            <w:pPr>
+              <w:cnfStyle w:val="000000000000" w:firstRow="0" w:lastRow="0" w:firstColumn="0" w:lastColumn="0" w:oddVBand="0" w:evenVBand="0" w:oddHBand="0" w:evenHBand="0" w:firstRowFirstColumn="0" w:firstRowLastColumn="0" w:lastRowFirstColumn="0" w:lastRowLastColumn="0"/>
+              <w:rPr>
+                <w:rFonts w:ascii="Times New Roman" w:eastAsia="Times New Roman" w:hAnsi="Times New Roman" w:cs="Times New Roman"/>
+                <w:kern w:val="0"/>
+                <w:szCs w:val="24"/>
+                <w:lang w:eastAsia="en-GB"/>
+                <w14:ligatures w14:val="none"/>
+              </w:rPr>
+            </w:pPr>
+            <w:r>
+              <w:rPr>
+                <w:rFonts w:ascii="Times New Roman" w:eastAsia="Times New Roman" w:hAnsi="Times New Roman" w:cs="Times New Roman"/>
+                <w:kern w:val="0"/>
+                <w:szCs w:val="24"/>
+                <w:lang w:eastAsia="en-GB"/>
+                <w14:ligatures w14:val="none"/>
+              </w:rPr>
+              <w:t>12-Mar-2026</w:t>
+            </w:r>
+          </w:p>
+        </w:tc>
+        <w:tc>
+          <w:tcPr>
+            <w:tcW w:w="9156" w:type="dxa"/>
+          </w:tcPr>
+          <w:p>
+            <w:pPr>
+              <w:jc w:val="center"/>
+              <w:cnfStyle w:val="000000000000" w:firstRow="0" w:lastRow="0" w:firstColumn="0" w:lastColumn="0" w:oddVBand="0" w:evenVBand="0" w:oddHBand="0" w:evenHBand="0" w:firstRowFirstColumn="0" w:firstRowLastColumn="0" w:lastRowFirstColumn="0" w:lastRowLastColumn="0"/>
+              <w:rPr>
+                <w:rFonts w:ascii="Times New Roman" w:eastAsia="Times New Roman" w:hAnsi="Times New Roman" w:cs="Times New Roman"/>
+                <w:noProof/>
+                <w:kern w:val="0"/>
+                <w:szCs w:val="24"/>
+                <w:lang w:eastAsia="en-GB"/>
+              </w:rPr>
+            </w:pPr>
+            <w:r>
+              <w:rPr>
+                <w:rFonts w:ascii="Times New Roman" w:eastAsia="Times New Roman" w:hAnsi="Times New Roman" w:cs="Times New Roman"/>
+                <w:noProof/>
+                <w:kern w:val="0"/>
+                <w:szCs w:val="24"/>
+                <w:lang w:eastAsia="en-GB"/>
+              </w:rPr>
+              <w:drawing>
+                <wp:inline distT="0" distB="0" distL="0" distR="0" wp14:anchorId="493FB267" wp14:editId="2BABEF5D">
+                  <wp:extent cx="4394200" cy="2197100"/>
+                  <wp:effectExtent l="0" t="0" r="0" b="0"/>
+                  <wp:docPr id="1189493338" name="Picture 3" descr="A screenshot of a computer&#10;&#10;AI-generated content may be incorrect."/>
+                  <wp:cNvGraphicFramePr>
+                    <a:graphicFrameLocks xmlns:a="http://schemas.openxmlformats.org/drawingml/2006/main" noChangeAspect="1"/>
+                  </wp:cNvGraphicFramePr>
+                  <a:graphic xmlns:a="http://schemas.openxmlformats.org/drawingml/2006/main">
+                    <a:graphicData uri="http://schemas.openxmlformats.org/drawingml/2006/picture">
+                      <pic:pic xmlns:pic="http://schemas.openxmlformats.org/drawingml/2006/picture">
+                        <pic:nvPicPr>
+                          <pic:cNvPr id="1842616698" name="Picture 3" descr="A screenshot of a computer&#10;&#10;AI-generated content may be incorrect."/>
+                          <pic:cNvPicPr/>
+                        </pic:nvPicPr>
+                        <pic:blipFill>
+                          <a:blip r:embed="rId36">
+                            <a:extLst>
+                              <a:ext uri="{28A0092B-C50C-407E-A947-70E740481C1C}">
+                                <a14:useLocalDpi xmlns:a14="http://schemas.microsoft.com/office/drawing/2010/main" val="0"/>
+                              </a:ext>
+                            </a:extLst>
+                          </a:blip>
+                          <a:stretch>
+                            <a:fillRect/>
+                          </a:stretch>
+                        </pic:blipFill>
+                        <pic:spPr>
+                          <a:xfrm>
+                            <a:off x="0" y="0"/>
+                            <a:ext cx="4394200" cy="2197100"/>
+                          </a:xfrm>
+                          <a:prstGeom prst="rect">
+                            <a:avLst/>
+                          </a:prstGeom>
+                        </pic:spPr>
+                      </pic:pic>
+                    </a:graphicData>
+                  </a:graphic>
+                </wp:inline>
+              </w:drawing>
+            </w:r>
+          </w:p>
+        </w:tc>
+      </w:tr>
+      <w:tr>
+        <w:tc>
+          <w:tcPr>
+            <w:cnfStyle w:val="001000000000" w:firstRow="0" w:lastRow="0" w:firstColumn="1" w:lastColumn="0" w:oddVBand="0" w:evenVBand="0" w:oddHBand="0" w:evenHBand="0" w:firstRowFirstColumn="0" w:firstRowLastColumn="0" w:lastRowFirstColumn="0" w:lastRowLastColumn="0"/>
+            <w:tcW w:w="912" w:type="dxa"/>
+          </w:tcPr>
+          <w:p>
+            <w:pPr>
+              <w:rPr>
+                <w:rFonts w:ascii="Times New Roman" w:hAnsi="Times New Roman" w:cs="Times New Roman"/>
+              </w:rPr>
+            </w:pPr>
+            <w:r>
+              <w:rPr>
+                <w:rFonts w:ascii="Times New Roman" w:hAnsi="Times New Roman" w:cs="Times New Roman"/>
+              </w:rPr>
+              <w:t>TC041</w:t>
+            </w:r>
+          </w:p>
+        </w:tc>
+        <w:tc>
+          <w:tcPr>
+            <w:tcW w:w="1853" w:type="dxa"/>
+          </w:tcPr>
+          <w:p>
+            <w:pPr>
+              <w:cnfStyle w:val="000000000000" w:firstRow="0" w:lastRow="0" w:firstColumn="0" w:lastColumn="0" w:oddVBand="0" w:evenVBand="0" w:oddHBand="0" w:evenHBand="0" w:firstRowFirstColumn="0" w:firstRowLastColumn="0" w:lastRowFirstColumn="0" w:lastRowLastColumn="0"/>
+              <w:rPr>
+                <w:rFonts w:ascii="Times New Roman" w:hAnsi="Times New Roman" w:cs="Times New Roman"/>
+              </w:rPr>
+            </w:pPr>
+            <w:r>
+              <w:rPr>
+                <w:rFonts w:ascii="Times New Roman" w:hAnsi="Times New Roman" w:cs="Times New Roman"/>
+              </w:rPr>
+              <w:t>Target Date</w:t>
+            </w:r>
+          </w:p>
+        </w:tc>
+        <w:tc>
+          <w:tcPr>
+            <w:tcW w:w="2846" w:type="dxa"/>
+          </w:tcPr>
+          <w:p>
+            <w:pPr>
+              <w:cnfStyle w:val="000000000000" w:firstRow="0" w:lastRow="0" w:firstColumn="0" w:lastColumn="0" w:oddVBand="0" w:evenVBand="0" w:oddHBand="0" w:evenHBand="0" w:firstRowFirstColumn="0" w:firstRowLastColumn="0" w:lastRowFirstColumn="0" w:lastRowLastColumn="0"/>
+              <w:rPr>
+                <w:rFonts w:ascii="Times New Roman" w:hAnsi="Times New Roman" w:cs="Times New Roman"/>
+              </w:rPr>
+            </w:pPr>
+            <w:r>
+              <w:rPr>
+                <w:rFonts w:ascii="Times New Roman" w:hAnsi="Times New Roman" w:cs="Times New Roman"/>
+              </w:rPr>
+              <w:t>User on Set Goal page</w:t>
+            </w:r>
+          </w:p>
+        </w:tc>
+        <w:tc>
+          <w:tcPr>
+            <w:tcW w:w="2416" w:type="dxa"/>
+          </w:tcPr>
+          <w:p>
+            <w:pPr>
+              <w:cnfStyle w:val="000000000000" w:firstRow="0" w:lastRow="0" w:firstColumn="0" w:lastColumn="0" w:oddVBand="0" w:evenVBand="0" w:oddHBand="0" w:evenHBand="0" w:firstRowFirstColumn="0" w:firstRowLastColumn="0" w:lastRowFirstColumn="0" w:lastRowLastColumn="0"/>
+              <w:rPr>
+                <w:rFonts w:ascii="Times New Roman" w:hAnsi="Times New Roman" w:cs="Times New Roman"/>
+              </w:rPr>
+            </w:pPr>
+            <w:r>
+              <w:rPr>
+                <w:rFonts w:ascii="Times New Roman" w:hAnsi="Times New Roman" w:cs="Times New Roman"/>
+              </w:rPr>
+              <w:t>Click “</w:t>
+            </w:r>
+            <w:r>
+              <w:rPr>
+                <w:rFonts w:ascii="Times New Roman" w:hAnsi="Times New Roman" w:cs="Times New Roman"/>
+              </w:rPr>
+              <w:t>Set</w:t>
+            </w:r>
+            <w:r>
+              <w:rPr>
+                <w:rFonts w:ascii="Times New Roman" w:hAnsi="Times New Roman" w:cs="Times New Roman"/>
+              </w:rPr>
+              <w:t xml:space="preserve"> Goal” → Select target date → Save</w:t>
+            </w:r>
+          </w:p>
+        </w:tc>
+        <w:tc>
+          <w:tcPr>
+            <w:tcW w:w="2163" w:type="dxa"/>
+          </w:tcPr>
+          <w:p>
+            <w:pPr>
+              <w:cnfStyle w:val="000000000000" w:firstRow="0" w:lastRow="0" w:firstColumn="0" w:lastColumn="0" w:oddVBand="0" w:evenVBand="0" w:oddHBand="0" w:evenHBand="0" w:firstRowFirstColumn="0" w:firstRowLastColumn="0" w:lastRowFirstColumn="0" w:lastRowLastColumn="0"/>
+              <w:rPr>
+                <w:rFonts w:ascii="Times New Roman" w:hAnsi="Times New Roman" w:cs="Times New Roman"/>
+              </w:rPr>
+            </w:pPr>
+            <w:r>
+              <w:rPr>
+                <w:rFonts w:ascii="Times New Roman" w:hAnsi="Times New Roman" w:cs="Times New Roman"/>
+              </w:rPr>
+              <w:t>Date: 31-Mar-2026</w:t>
+            </w:r>
+          </w:p>
+        </w:tc>
+        <w:tc>
+          <w:tcPr>
+            <w:tcW w:w="1508" w:type="dxa"/>
+          </w:tcPr>
+          <w:p>
+            <w:pPr>
+              <w:cnfStyle w:val="000000000000" w:firstRow="0" w:lastRow="0" w:firstColumn="0" w:lastColumn="0" w:oddVBand="0" w:evenVBand="0" w:oddHBand="0" w:evenHBand="0" w:firstRowFirstColumn="0" w:firstRowLastColumn="0" w:lastRowFirstColumn="0" w:lastRowLastColumn="0"/>
+              <w:rPr>
+                <w:rFonts w:ascii="Times New Roman" w:hAnsi="Times New Roman" w:cs="Times New Roman"/>
+              </w:rPr>
+            </w:pPr>
+            <w:r>
+              <w:rPr>
+                <w:rFonts w:ascii="Times New Roman" w:hAnsi="Times New Roman" w:cs="Times New Roman"/>
+              </w:rPr>
+              <w:t>Target date accepted and displayed correctly</w:t>
+            </w:r>
+          </w:p>
+        </w:tc>
+        <w:tc>
+          <w:tcPr>
+            <w:tcW w:w="1508" w:type="dxa"/>
+          </w:tcPr>
+          <w:p>
+            <w:pPr>
+              <w:cnfStyle w:val="000000000000" w:firstRow="0" w:lastRow="0" w:firstColumn="0" w:lastColumn="0" w:oddVBand="0" w:evenVBand="0" w:oddHBand="0" w:evenHBand="0" w:firstRowFirstColumn="0" w:firstRowLastColumn="0" w:lastRowFirstColumn="0" w:lastRowLastColumn="0"/>
+              <w:rPr>
+                <w:rFonts w:ascii="Times New Roman" w:hAnsi="Times New Roman" w:cs="Times New Roman"/>
+              </w:rPr>
+            </w:pPr>
+            <w:r>
+              <w:rPr>
+                <w:rFonts w:ascii="Times New Roman" w:hAnsi="Times New Roman" w:cs="Times New Roman"/>
+              </w:rPr>
+              <w:t>Target date accepted and displayed correctly</w:t>
+            </w:r>
+          </w:p>
+        </w:tc>
+        <w:tc>
+          <w:tcPr>
+            <w:tcW w:w="857" w:type="dxa"/>
+          </w:tcPr>
+          <w:p>
+            <w:pPr>
+              <w:cnfStyle w:val="000000000000" w:firstRow="0" w:lastRow="0" w:firstColumn="0" w:lastColumn="0" w:oddVBand="0" w:evenVBand="0" w:oddHBand="0" w:evenHBand="0" w:firstRowFirstColumn="0" w:firstRowLastColumn="0" w:lastRowFirstColumn="0" w:lastRowLastColumn="0"/>
+              <w:rPr>
+                <w:rFonts w:ascii="Times New Roman" w:eastAsia="Times New Roman" w:hAnsi="Times New Roman" w:cs="Times New Roman"/>
+                <w:kern w:val="0"/>
+                <w:szCs w:val="24"/>
+                <w:lang w:eastAsia="en-GB"/>
+                <w14:ligatures w14:val="none"/>
+              </w:rPr>
+            </w:pPr>
+            <w:r>
+              <w:rPr>
+                <w:rFonts w:ascii="Times New Roman" w:eastAsia="Times New Roman" w:hAnsi="Times New Roman" w:cs="Times New Roman"/>
+                <w:kern w:val="0"/>
+                <w:szCs w:val="24"/>
+                <w:lang w:eastAsia="en-GB"/>
+                <w14:ligatures w14:val="none"/>
+              </w:rPr>
+              <w:t>Pass</w:t>
+            </w:r>
+          </w:p>
+        </w:tc>
+        <w:tc>
+          <w:tcPr>
+            <w:tcW w:w="1096" w:type="dxa"/>
+          </w:tcPr>
+          <w:p>
+            <w:pPr>
+              <w:cnfStyle w:val="000000000000" w:firstRow="0" w:lastRow="0" w:firstColumn="0" w:lastColumn="0" w:oddVBand="0" w:evenVBand="0" w:oddHBand="0" w:evenHBand="0" w:firstRowFirstColumn="0" w:firstRowLastColumn="0" w:lastRowFirstColumn="0" w:lastRowLastColumn="0"/>
+              <w:rPr>
+                <w:rFonts w:ascii="Times New Roman" w:eastAsia="Times New Roman" w:hAnsi="Times New Roman" w:cs="Times New Roman"/>
+                <w:kern w:val="0"/>
+                <w:szCs w:val="24"/>
+                <w:lang w:eastAsia="en-GB"/>
+                <w14:ligatures w14:val="none"/>
+              </w:rPr>
+            </w:pPr>
+            <w:r>
+              <w:rPr>
+                <w:rFonts w:ascii="Times New Roman" w:eastAsia="Times New Roman" w:hAnsi="Times New Roman" w:cs="Times New Roman"/>
+                <w:kern w:val="0"/>
+                <w:szCs w:val="24"/>
+                <w:lang w:eastAsia="en-GB"/>
+                <w14:ligatures w14:val="none"/>
+              </w:rPr>
+              <w:t>Zubayer</w:t>
+            </w:r>
+          </w:p>
+        </w:tc>
+        <w:tc>
+          <w:tcPr>
+            <w:tcW w:w="1123" w:type="dxa"/>
+          </w:tcPr>
+          <w:p>
+            <w:pPr>
+              <w:cnfStyle w:val="000000000000" w:firstRow="0" w:lastRow="0" w:firstColumn="0" w:lastColumn="0" w:oddVBand="0" w:evenVBand="0" w:oddHBand="0" w:evenHBand="0" w:firstRowFirstColumn="0" w:firstRowLastColumn="0" w:lastRowFirstColumn="0" w:lastRowLastColumn="0"/>
+              <w:rPr>
+                <w:rFonts w:ascii="Times New Roman" w:eastAsia="Times New Roman" w:hAnsi="Times New Roman" w:cs="Times New Roman"/>
+                <w:kern w:val="0"/>
+                <w:szCs w:val="24"/>
+                <w:lang w:eastAsia="en-GB"/>
+                <w14:ligatures w14:val="none"/>
+              </w:rPr>
+            </w:pPr>
+            <w:r>
+              <w:rPr>
+                <w:rFonts w:ascii="Times New Roman" w:eastAsia="Times New Roman" w:hAnsi="Times New Roman" w:cs="Times New Roman"/>
+                <w:kern w:val="0"/>
+                <w:szCs w:val="24"/>
+                <w:lang w:eastAsia="en-GB"/>
+                <w14:ligatures w14:val="none"/>
+              </w:rPr>
+              <w:t>12-Mar-2026</w:t>
+            </w:r>
+          </w:p>
+        </w:tc>
+        <w:tc>
+          <w:tcPr>
+            <w:tcW w:w="1163" w:type="dxa"/>
+          </w:tcPr>
+          <w:p>
+            <w:pPr>
+              <w:cnfStyle w:val="000000000000" w:firstRow="0" w:lastRow="0" w:firstColumn="0" w:lastColumn="0" w:oddVBand="0" w:evenVBand="0" w:oddHBand="0" w:evenHBand="0" w:firstRowFirstColumn="0" w:firstRowLastColumn="0" w:lastRowFirstColumn="0" w:lastRowLastColumn="0"/>
+              <w:rPr>
+                <w:rFonts w:ascii="Times New Roman" w:eastAsia="Times New Roman" w:hAnsi="Times New Roman" w:cs="Times New Roman"/>
+                <w:kern w:val="0"/>
+                <w:szCs w:val="24"/>
+                <w:lang w:eastAsia="en-GB"/>
+                <w14:ligatures w14:val="none"/>
+              </w:rPr>
+            </w:pPr>
+            <w:r>
+              <w:rPr>
+                <w:rFonts w:ascii="Times New Roman" w:eastAsia="Times New Roman" w:hAnsi="Times New Roman" w:cs="Times New Roman"/>
+                <w:kern w:val="0"/>
+                <w:szCs w:val="24"/>
+                <w:lang w:eastAsia="en-GB"/>
+                <w14:ligatures w14:val="none"/>
+              </w:rPr>
+              <w:t>Zubayer</w:t>
+            </w:r>
+          </w:p>
+        </w:tc>
+        <w:tc>
+          <w:tcPr>
+            <w:tcW w:w="1243" w:type="dxa"/>
+          </w:tcPr>
+          <w:p>
+            <w:pPr>
+              <w:cnfStyle w:val="000000000000" w:firstRow="0" w:lastRow="0" w:firstColumn="0" w:lastColumn="0" w:oddVBand="0" w:evenVBand="0" w:oddHBand="0" w:evenHBand="0" w:firstRowFirstColumn="0" w:firstRowLastColumn="0" w:lastRowFirstColumn="0" w:lastRowLastColumn="0"/>
+              <w:rPr>
+                <w:rFonts w:ascii="Times New Roman" w:eastAsia="Times New Roman" w:hAnsi="Times New Roman" w:cs="Times New Roman"/>
+                <w:kern w:val="0"/>
+                <w:szCs w:val="24"/>
+                <w:lang w:eastAsia="en-GB"/>
+                <w14:ligatures w14:val="none"/>
+              </w:rPr>
+            </w:pPr>
+            <w:r>
+              <w:rPr>
+                <w:rFonts w:ascii="Times New Roman" w:eastAsia="Times New Roman" w:hAnsi="Times New Roman" w:cs="Times New Roman"/>
+                <w:kern w:val="0"/>
+                <w:szCs w:val="24"/>
+                <w:lang w:eastAsia="en-GB"/>
+                <w14:ligatures w14:val="none"/>
+              </w:rPr>
+              <w:t>12-Mar-2026</w:t>
+            </w:r>
+          </w:p>
+        </w:tc>
+        <w:tc>
+          <w:tcPr>
+            <w:tcW w:w="9156" w:type="dxa"/>
+          </w:tcPr>
+          <w:p>
+            <w:pPr>
+              <w:jc w:val="center"/>
+              <w:cnfStyle w:val="000000000000" w:firstRow="0" w:lastRow="0" w:firstColumn="0" w:lastColumn="0" w:oddVBand="0" w:evenVBand="0" w:oddHBand="0" w:evenHBand="0" w:firstRowFirstColumn="0" w:firstRowLastColumn="0" w:lastRowFirstColumn="0" w:lastRowLastColumn="0"/>
+              <w:rPr>
+                <w:rFonts w:ascii="Times New Roman" w:eastAsia="Times New Roman" w:hAnsi="Times New Roman" w:cs="Times New Roman"/>
+                <w:noProof/>
+                <w:kern w:val="0"/>
+                <w:szCs w:val="24"/>
+                <w:lang w:eastAsia="en-GB"/>
+              </w:rPr>
+            </w:pPr>
+            <w:r>
+              <w:rPr>
+                <w:rFonts w:ascii="Times New Roman" w:eastAsia="Times New Roman" w:hAnsi="Times New Roman" w:cs="Times New Roman"/>
+                <w:noProof/>
+                <w:kern w:val="0"/>
+                <w:szCs w:val="24"/>
+                <w:lang w:eastAsia="en-GB"/>
+              </w:rPr>
+              <w:drawing>
+                <wp:inline distT="0" distB="0" distL="0" distR="0" wp14:anchorId="572C9656" wp14:editId="649053CE">
+                  <wp:extent cx="4394200" cy="2197100"/>
+                  <wp:effectExtent l="0" t="0" r="0" b="0"/>
+                  <wp:docPr id="336248176" name="Picture 3" descr="A screenshot of a computer&#10;&#10;AI-generated content may be incorrect."/>
+                  <wp:cNvGraphicFramePr>
+                    <a:graphicFrameLocks xmlns:a="http://schemas.openxmlformats.org/drawingml/2006/main" noChangeAspect="1"/>
+                  </wp:cNvGraphicFramePr>
+                  <a:graphic xmlns:a="http://schemas.openxmlformats.org/drawingml/2006/main">
+                    <a:graphicData uri="http://schemas.openxmlformats.org/drawingml/2006/picture">
+                      <pic:pic xmlns:pic="http://schemas.openxmlformats.org/drawingml/2006/picture">
+                        <pic:nvPicPr>
+                          <pic:cNvPr id="1842616698" name="Picture 3" descr="A screenshot of a computer&#10;&#10;AI-generated content may be incorrect."/>
+                          <pic:cNvPicPr/>
+                        </pic:nvPicPr>
+                        <pic:blipFill>
+                          <a:blip r:embed="rId36">
+                            <a:extLst>
+                              <a:ext uri="{28A0092B-C50C-407E-A947-70E740481C1C}">
+                                <a14:useLocalDpi xmlns:a14="http://schemas.microsoft.com/office/drawing/2010/main" val="0"/>
+                              </a:ext>
+                            </a:extLst>
+                          </a:blip>
+                          <a:stretch>
+                            <a:fillRect/>
+                          </a:stretch>
+                        </pic:blipFill>
+                        <pic:spPr>
+                          <a:xfrm>
+                            <a:off x="0" y="0"/>
+                            <a:ext cx="4394200" cy="2197100"/>
+                          </a:xfrm>
+                          <a:prstGeom prst="rect">
+                            <a:avLst/>
+                          </a:prstGeom>
+                        </pic:spPr>
+                      </pic:pic>
+                    </a:graphicData>
+                  </a:graphic>
+                </wp:inline>
+              </w:drawing>
+            </w:r>
+          </w:p>
+        </w:tc>
+      </w:tr>
+      <w:tr>
+        <w:tc>
+          <w:tcPr>
+            <w:cnfStyle w:val="001000000000" w:firstRow="0" w:lastRow="0" w:firstColumn="1" w:lastColumn="0" w:oddVBand="0" w:evenVBand="0" w:oddHBand="0" w:evenHBand="0" w:firstRowFirstColumn="0" w:firstRowLastColumn="0" w:lastRowFirstColumn="0" w:lastRowLastColumn="0"/>
+            <w:tcW w:w="912" w:type="dxa"/>
+          </w:tcPr>
+          <w:p>
+            <w:pPr>
+              <w:rPr>
+                <w:rFonts w:ascii="Times New Roman" w:hAnsi="Times New Roman" w:cs="Times New Roman"/>
+              </w:rPr>
+            </w:pPr>
+            <w:r>
+              <w:rPr>
+                <w:rFonts w:ascii="Times New Roman" w:hAnsi="Times New Roman" w:cs="Times New Roman"/>
+              </w:rPr>
+              <w:t>TC042</w:t>
+            </w:r>
+          </w:p>
+        </w:tc>
+        <w:tc>
+          <w:tcPr>
+            <w:tcW w:w="1853" w:type="dxa"/>
+          </w:tcPr>
+          <w:tbl>
+            <w:tblPr>
+              <w:tblW w:w="0" w:type="auto"/>
+              <w:tblCellSpacing w:w="15" w:type="dxa"/>
+              <w:tblCellMar>
+                <w:top w:w="15" w:type="dxa"/>
+                <w:left w:w="15" w:type="dxa"/>
+                <w:bottom w:w="15" w:type="dxa"/>
+                <w:right w:w="15" w:type="dxa"/>
+              </w:tblCellMar>
+              <w:tblLook w:val="04A0" w:firstRow="1" w:lastRow="0" w:firstColumn="1" w:lastColumn="0" w:noHBand="0" w:noVBand="1"/>
+            </w:tblPr>
+            <w:tblGrid>
+              <w:gridCol w:w="110"/>
+            </w:tblGrid>
+            <w:tr>
+              <w:trPr>
+                <w:tblCellSpacing w:w="15" w:type="dxa"/>
+              </w:trPr>
+              <w:tc>
+                <w:tcPr>
+                  <w:tcW w:w="36" w:type="dxa"/>
+                  <w:vAlign w:val="center"/>
+                  <w:hideMark/>
+                </w:tcPr>
+                <w:p>
+                  <w:pPr>
+                    <w:rPr>
+                      <w:rFonts w:ascii="Times New Roman" w:hAnsi="Times New Roman" w:cs="Times New Roman"/>
+                    </w:rPr>
+                  </w:pPr>
+                </w:p>
+              </w:tc>
+            </w:tr>
+          </w:tbl>
+          <w:p>
+            <w:pPr>
+              <w:cnfStyle w:val="000000000000" w:firstRow="0" w:lastRow="0" w:firstColumn="0" w:lastColumn="0" w:oddVBand="0" w:evenVBand="0" w:oddHBand="0" w:evenHBand="0" w:firstRowFirstColumn="0" w:firstRowLastColumn="0" w:lastRowFirstColumn="0" w:lastRowLastColumn="0"/>
+              <w:rPr>
+                <w:rFonts w:ascii="Times New Roman" w:hAnsi="Times New Roman" w:cs="Times New Roman"/>
+                <w:vanish/>
+              </w:rPr>
+            </w:pPr>
+          </w:p>
+          <w:tbl>
+            <w:tblPr>
+              <w:tblW w:w="0" w:type="auto"/>
+              <w:tblCellSpacing w:w="15" w:type="dxa"/>
+              <w:tblCellMar>
+                <w:top w:w="15" w:type="dxa"/>
+                <w:left w:w="15" w:type="dxa"/>
+                <w:bottom w:w="15" w:type="dxa"/>
+                <w:right w:w="15" w:type="dxa"/>
+              </w:tblCellMar>
+              <w:tblLook w:val="04A0" w:firstRow="1" w:lastRow="0" w:firstColumn="1" w:lastColumn="0" w:noHBand="0" w:noVBand="1"/>
+            </w:tblPr>
+            <w:tblGrid>
+              <w:gridCol w:w="1697"/>
+            </w:tblGrid>
+            <w:tr>
+              <w:trPr>
+                <w:tblCellSpacing w:w="15" w:type="dxa"/>
+              </w:trPr>
+              <w:tc>
+                <w:tcPr>
+                  <w:tcW w:w="1637" w:type="dxa"/>
+                  <w:vAlign w:val="center"/>
+                  <w:hideMark/>
+                </w:tcPr>
+                <w:p>
+                  <w:pPr>
+                    <w:rPr>
+                      <w:rFonts w:ascii="Times New Roman" w:hAnsi="Times New Roman" w:cs="Times New Roman"/>
+                      <w:szCs w:val="24"/>
+                    </w:rPr>
+                  </w:pPr>
+                  <w:r>
+                    <w:rPr>
+                      <w:rFonts w:ascii="Times New Roman" w:hAnsi="Times New Roman" w:cs="Times New Roman"/>
+                    </w:rPr>
+                    <w:t>Manage Settings</w:t>
+                  </w:r>
+                </w:p>
+              </w:tc>
+            </w:tr>
+          </w:tbl>
+          <w:p>
+            <w:pPr>
+              <w:cnfStyle w:val="000000000000" w:firstRow="0" w:lastRow="0" w:firstColumn="0" w:lastColumn="0" w:oddVBand="0" w:evenVBand="0" w:oddHBand="0" w:evenHBand="0" w:firstRowFirstColumn="0" w:firstRowLastColumn="0" w:lastRowFirstColumn="0" w:lastRowLastColumn="0"/>
+              <w:rPr>
+                <w:rFonts w:ascii="Times New Roman" w:hAnsi="Times New Roman" w:cs="Times New Roman"/>
+              </w:rPr>
+            </w:pPr>
+          </w:p>
+        </w:tc>
+        <w:tc>
+          <w:tcPr>
+            <w:tcW w:w="2846" w:type="dxa"/>
+          </w:tcPr>
+          <w:p>
+            <w:pPr>
+              <w:cnfStyle w:val="000000000000" w:firstRow="0" w:lastRow="0" w:firstColumn="0" w:lastColumn="0" w:oddVBand="0" w:evenVBand="0" w:oddHBand="0" w:evenHBand="0" w:firstRowFirstColumn="0" w:firstRowLastColumn="0" w:lastRowFirstColumn="0" w:lastRowLastColumn="0"/>
+              <w:rPr>
+                <w:rFonts w:ascii="Times New Roman" w:hAnsi="Times New Roman" w:cs="Times New Roman"/>
+              </w:rPr>
+            </w:pPr>
+            <w:r>
+              <w:rPr>
+                <w:rFonts w:ascii="Times New Roman" w:hAnsi="Times New Roman" w:cs="Times New Roman"/>
+              </w:rPr>
+              <w:t>User logged in</w:t>
+            </w:r>
+          </w:p>
+        </w:tc>
+        <w:tc>
+          <w:tcPr>
+            <w:tcW w:w="2416" w:type="dxa"/>
+          </w:tcPr>
+          <w:p>
+            <w:pPr>
+              <w:cnfStyle w:val="000000000000" w:firstRow="0" w:lastRow="0" w:firstColumn="0" w:lastColumn="0" w:oddVBand="0" w:evenVBand="0" w:oddHBand="0" w:evenHBand="0" w:firstRowFirstColumn="0" w:firstRowLastColumn="0" w:lastRowFirstColumn="0" w:lastRowLastColumn="0"/>
+              <w:rPr>
+                <w:rFonts w:ascii="Times New Roman" w:hAnsi="Times New Roman" w:cs="Times New Roman"/>
+              </w:rPr>
+            </w:pPr>
+            <w:r>
+              <w:rPr>
+                <w:rFonts w:ascii="Times New Roman" w:hAnsi="Times New Roman" w:cs="Times New Roman"/>
+              </w:rPr>
+              <w:t>Navigate to Settings page → Make changes → Save changes</w:t>
+            </w:r>
+          </w:p>
+        </w:tc>
+        <w:tc>
+          <w:tcPr>
+            <w:tcW w:w="2163" w:type="dxa"/>
+          </w:tcPr>
+          <w:p>
+            <w:pPr>
+              <w:cnfStyle w:val="000000000000" w:firstRow="0" w:lastRow="0" w:firstColumn="0" w:lastColumn="0" w:oddVBand="0" w:evenVBand="0" w:oddHBand="0" w:evenHBand="0" w:firstRowFirstColumn="0" w:firstRowLastColumn="0" w:lastRowFirstColumn="0" w:lastRowLastColumn="0"/>
+              <w:rPr>
+                <w:rFonts w:ascii="Times New Roman" w:hAnsi="Times New Roman" w:cs="Times New Roman"/>
+              </w:rPr>
+            </w:pPr>
+            <w:r>
+              <w:rPr>
+                <w:rFonts w:ascii="Times New Roman" w:hAnsi="Times New Roman" w:cs="Times New Roman"/>
+              </w:rPr>
+              <w:t>Change theme to “Dark Mode”</w:t>
+            </w:r>
+          </w:p>
+        </w:tc>
+        <w:tc>
+          <w:tcPr>
+            <w:tcW w:w="1508" w:type="dxa"/>
+          </w:tcPr>
+          <w:p>
+            <w:pPr>
+              <w:cnfStyle w:val="000000000000" w:firstRow="0" w:lastRow="0" w:firstColumn="0" w:lastColumn="0" w:oddVBand="0" w:evenVBand="0" w:oddHBand="0" w:evenHBand="0" w:firstRowFirstColumn="0" w:firstRowLastColumn="0" w:lastRowFirstColumn="0" w:lastRowLastColumn="0"/>
+              <w:rPr>
+                <w:rFonts w:ascii="Times New Roman" w:hAnsi="Times New Roman" w:cs="Times New Roman"/>
+              </w:rPr>
+            </w:pPr>
+            <w:r>
+              <w:rPr>
+                <w:rFonts w:ascii="Times New Roman" w:hAnsi="Times New Roman" w:cs="Times New Roman"/>
+              </w:rPr>
+              <w:t>Settings updated successfully</w:t>
+            </w:r>
+          </w:p>
+        </w:tc>
+        <w:tc>
+          <w:tcPr>
+            <w:tcW w:w="1508" w:type="dxa"/>
+          </w:tcPr>
+          <w:p>
+            <w:pPr>
+              <w:cnfStyle w:val="000000000000" w:firstRow="0" w:lastRow="0" w:firstColumn="0" w:lastColumn="0" w:oddVBand="0" w:evenVBand="0" w:oddHBand="0" w:evenHBand="0" w:firstRowFirstColumn="0" w:firstRowLastColumn="0" w:lastRowFirstColumn="0" w:lastRowLastColumn="0"/>
+              <w:rPr>
+                <w:rFonts w:ascii="Times New Roman" w:hAnsi="Times New Roman" w:cs="Times New Roman"/>
+              </w:rPr>
+            </w:pPr>
+            <w:r>
+              <w:rPr>
+                <w:rFonts w:ascii="Times New Roman" w:hAnsi="Times New Roman" w:cs="Times New Roman"/>
+              </w:rPr>
+              <w:t>Settings updated successfully</w:t>
+            </w:r>
+          </w:p>
+        </w:tc>
+        <w:tc>
+          <w:tcPr>
+            <w:tcW w:w="857" w:type="dxa"/>
+          </w:tcPr>
+          <w:p>
+            <w:pPr>
+              <w:cnfStyle w:val="000000000000" w:firstRow="0" w:lastRow="0" w:firstColumn="0" w:lastColumn="0" w:oddVBand="0" w:evenVBand="0" w:oddHBand="0" w:evenHBand="0" w:firstRowFirstColumn="0" w:firstRowLastColumn="0" w:lastRowFirstColumn="0" w:lastRowLastColumn="0"/>
+              <w:rPr>
+                <w:rFonts w:ascii="Times New Roman" w:eastAsia="Times New Roman" w:hAnsi="Times New Roman" w:cs="Times New Roman"/>
+                <w:kern w:val="0"/>
+                <w:szCs w:val="24"/>
+                <w:lang w:eastAsia="en-GB"/>
+                <w14:ligatures w14:val="none"/>
+              </w:rPr>
+            </w:pPr>
+            <w:r>
+              <w:rPr>
+                <w:rFonts w:ascii="Times New Roman" w:eastAsia="Times New Roman" w:hAnsi="Times New Roman" w:cs="Times New Roman"/>
+                <w:kern w:val="0"/>
+                <w:szCs w:val="24"/>
+                <w:lang w:eastAsia="en-GB"/>
+                <w14:ligatures w14:val="none"/>
+              </w:rPr>
+              <w:t>Pass</w:t>
+            </w:r>
+          </w:p>
+        </w:tc>
+        <w:tc>
+          <w:tcPr>
+            <w:tcW w:w="1096" w:type="dxa"/>
+          </w:tcPr>
+          <w:p>
+            <w:pPr>
+              <w:cnfStyle w:val="000000000000" w:firstRow="0" w:lastRow="0" w:firstColumn="0" w:lastColumn="0" w:oddVBand="0" w:evenVBand="0" w:oddHBand="0" w:evenHBand="0" w:firstRowFirstColumn="0" w:firstRowLastColumn="0" w:lastRowFirstColumn="0" w:lastRowLastColumn="0"/>
+              <w:rPr>
+                <w:rFonts w:ascii="Times New Roman" w:eastAsia="Times New Roman" w:hAnsi="Times New Roman" w:cs="Times New Roman"/>
+                <w:kern w:val="0"/>
+                <w:szCs w:val="24"/>
+                <w:lang w:eastAsia="en-GB"/>
+                <w14:ligatures w14:val="none"/>
+              </w:rPr>
+            </w:pPr>
+            <w:r>
+              <w:rPr>
+                <w:rFonts w:ascii="Times New Roman" w:eastAsia="Times New Roman" w:hAnsi="Times New Roman" w:cs="Times New Roman"/>
+                <w:kern w:val="0"/>
+                <w:szCs w:val="24"/>
+                <w:lang w:eastAsia="en-GB"/>
+                <w14:ligatures w14:val="none"/>
+              </w:rPr>
+              <w:t>Zubayer</w:t>
+            </w:r>
+          </w:p>
+        </w:tc>
+        <w:tc>
+          <w:tcPr>
+            <w:tcW w:w="1123" w:type="dxa"/>
+          </w:tcPr>
+          <w:p>
+            <w:pPr>
+              <w:cnfStyle w:val="000000000000" w:firstRow="0" w:lastRow="0" w:firstColumn="0" w:lastColumn="0" w:oddVBand="0" w:evenVBand="0" w:oddHBand="0" w:evenHBand="0" w:firstRowFirstColumn="0" w:firstRowLastColumn="0" w:lastRowFirstColumn="0" w:lastRowLastColumn="0"/>
+              <w:rPr>
+                <w:rFonts w:ascii="Times New Roman" w:eastAsia="Times New Roman" w:hAnsi="Times New Roman" w:cs="Times New Roman"/>
+                <w:kern w:val="0"/>
+                <w:szCs w:val="24"/>
+                <w:lang w:eastAsia="en-GB"/>
+                <w14:ligatures w14:val="none"/>
+              </w:rPr>
+            </w:pPr>
+            <w:r>
+              <w:rPr>
+                <w:rFonts w:ascii="Times New Roman" w:eastAsia="Times New Roman" w:hAnsi="Times New Roman" w:cs="Times New Roman"/>
+                <w:kern w:val="0"/>
+                <w:szCs w:val="24"/>
+                <w:lang w:eastAsia="en-GB"/>
+                <w14:ligatures w14:val="none"/>
+              </w:rPr>
+              <w:t>12-Mar-2026</w:t>
+            </w:r>
+          </w:p>
+        </w:tc>
+        <w:tc>
+          <w:tcPr>
+            <w:tcW w:w="1163" w:type="dxa"/>
+          </w:tcPr>
+          <w:p>
+            <w:pPr>
+              <w:cnfStyle w:val="000000000000" w:firstRow="0" w:lastRow="0" w:firstColumn="0" w:lastColumn="0" w:oddVBand="0" w:evenVBand="0" w:oddHBand="0" w:evenHBand="0" w:firstRowFirstColumn="0" w:firstRowLastColumn="0" w:lastRowFirstColumn="0" w:lastRowLastColumn="0"/>
+              <w:rPr>
+                <w:rFonts w:ascii="Times New Roman" w:eastAsia="Times New Roman" w:hAnsi="Times New Roman" w:cs="Times New Roman"/>
+                <w:kern w:val="0"/>
+                <w:szCs w:val="24"/>
+                <w:lang w:eastAsia="en-GB"/>
+                <w14:ligatures w14:val="none"/>
+              </w:rPr>
+            </w:pPr>
+            <w:r>
+              <w:rPr>
+                <w:rFonts w:ascii="Times New Roman" w:eastAsia="Times New Roman" w:hAnsi="Times New Roman" w:cs="Times New Roman"/>
+                <w:kern w:val="0"/>
+                <w:szCs w:val="24"/>
+                <w:lang w:eastAsia="en-GB"/>
+                <w14:ligatures w14:val="none"/>
+              </w:rPr>
+              <w:t>Zubayer</w:t>
+            </w:r>
+          </w:p>
+        </w:tc>
+        <w:tc>
+          <w:tcPr>
+            <w:tcW w:w="1243" w:type="dxa"/>
+          </w:tcPr>
+          <w:p>
+            <w:pPr>
+              <w:cnfStyle w:val="000000000000" w:firstRow="0" w:lastRow="0" w:firstColumn="0" w:lastColumn="0" w:oddVBand="0" w:evenVBand="0" w:oddHBand="0" w:evenHBand="0" w:firstRowFirstColumn="0" w:firstRowLastColumn="0" w:lastRowFirstColumn="0" w:lastRowLastColumn="0"/>
+              <w:rPr>
+                <w:rFonts w:ascii="Times New Roman" w:eastAsia="Times New Roman" w:hAnsi="Times New Roman" w:cs="Times New Roman"/>
+                <w:kern w:val="0"/>
+                <w:szCs w:val="24"/>
+                <w:lang w:eastAsia="en-GB"/>
+                <w14:ligatures w14:val="none"/>
+              </w:rPr>
+            </w:pPr>
+            <w:r>
+              <w:rPr>
+                <w:rFonts w:ascii="Times New Roman" w:eastAsia="Times New Roman" w:hAnsi="Times New Roman" w:cs="Times New Roman"/>
+                <w:kern w:val="0"/>
+                <w:szCs w:val="24"/>
+                <w:lang w:eastAsia="en-GB"/>
+                <w14:ligatures w14:val="none"/>
+              </w:rPr>
+              <w:t>12-Mar-2026</w:t>
+            </w:r>
+          </w:p>
+        </w:tc>
+        <w:tc>
+          <w:tcPr>
+            <w:tcW w:w="9156" w:type="dxa"/>
+          </w:tcPr>
+          <w:p>
+            <w:pPr>
+              <w:jc w:val="center"/>
+              <w:cnfStyle w:val="000000000000" w:firstRow="0" w:lastRow="0" w:firstColumn="0" w:lastColumn="0" w:oddVBand="0" w:evenVBand="0" w:oddHBand="0" w:evenHBand="0" w:firstRowFirstColumn="0" w:firstRowLastColumn="0" w:lastRowFirstColumn="0" w:lastRowLastColumn="0"/>
+              <w:rPr>
+                <w:rFonts w:ascii="Times New Roman" w:eastAsia="Times New Roman" w:hAnsi="Times New Roman" w:cs="Times New Roman"/>
+                <w:noProof/>
+                <w:kern w:val="0"/>
+                <w:szCs w:val="24"/>
+                <w:lang w:eastAsia="en-GB"/>
+              </w:rPr>
+            </w:pPr>
+            <w:r>
+              <w:rPr>
+                <w:rFonts w:ascii="Times New Roman" w:eastAsia="Times New Roman" w:hAnsi="Times New Roman" w:cs="Times New Roman"/>
+                <w:noProof/>
+                <w:kern w:val="0"/>
+                <w:szCs w:val="24"/>
+                <w:lang w:eastAsia="en-GB"/>
+              </w:rPr>
+              <w:drawing>
+                <wp:inline distT="0" distB="0" distL="0" distR="0" wp14:anchorId="613BEF15" wp14:editId="217545BE">
+                  <wp:extent cx="4178460" cy="2881630"/>
+                  <wp:effectExtent l="0" t="0" r="0" b="1270"/>
+                  <wp:docPr id="1201985476" name="Picture 4" descr="A screenshot of a computer&#10;&#10;AI-generated content may be incorrect."/>
+                  <wp:cNvGraphicFramePr>
+                    <a:graphicFrameLocks xmlns:a="http://schemas.openxmlformats.org/drawingml/2006/main" noChangeAspect="1"/>
+                  </wp:cNvGraphicFramePr>
+                  <a:graphic xmlns:a="http://schemas.openxmlformats.org/drawingml/2006/main">
+                    <a:graphicData uri="http://schemas.openxmlformats.org/drawingml/2006/picture">
+                      <pic:pic xmlns:pic="http://schemas.openxmlformats.org/drawingml/2006/picture">
+                        <pic:nvPicPr>
+                          <pic:cNvPr id="1201985476" name="Picture 4" descr="A screenshot of a computer&#10;&#10;AI-generated content may be incorrect."/>
+                          <pic:cNvPicPr/>
+                        </pic:nvPicPr>
+                        <pic:blipFill>
+                          <a:blip r:embed="rId37">
+                            <a:extLst>
+                              <a:ext uri="{28A0092B-C50C-407E-A947-70E740481C1C}">
+                                <a14:useLocalDpi xmlns:a14="http://schemas.microsoft.com/office/drawing/2010/main" val="0"/>
+                              </a:ext>
+                            </a:extLst>
+                          </a:blip>
+                          <a:stretch>
+                            <a:fillRect/>
+                          </a:stretch>
+                        </pic:blipFill>
+                        <pic:spPr>
+                          <a:xfrm>
+                            <a:off x="0" y="0"/>
+                            <a:ext cx="4206163" cy="2900735"/>
+                          </a:xfrm>
+                          <a:prstGeom prst="rect">
+                            <a:avLst/>
+                          </a:prstGeom>
+                        </pic:spPr>
+                      </pic:pic>
+                    </a:graphicData>
+                  </a:graphic>
+                </wp:inline>
+              </w:drawing>
+            </w:r>
+          </w:p>
+        </w:tc>
+      </w:tr>
+      <w:tr>
+        <w:tc>
+          <w:tcPr>
+            <w:cnfStyle w:val="001000000000" w:firstRow="0" w:lastRow="0" w:firstColumn="1" w:lastColumn="0" w:oddVBand="0" w:evenVBand="0" w:oddHBand="0" w:evenHBand="0" w:firstRowFirstColumn="0" w:firstRowLastColumn="0" w:lastRowFirstColumn="0" w:lastRowLastColumn="0"/>
+            <w:tcW w:w="912" w:type="dxa"/>
+          </w:tcPr>
+          <w:p>
+            <w:pPr>
+              <w:rPr>
+                <w:rFonts w:ascii="Times New Roman" w:hAnsi="Times New Roman" w:cs="Times New Roman"/>
+              </w:rPr>
+            </w:pPr>
+            <w:r>
+              <w:rPr>
+                <w:rFonts w:ascii="Times New Roman" w:hAnsi="Times New Roman" w:cs="Times New Roman"/>
+              </w:rPr>
+              <w:t>TC043</w:t>
+            </w:r>
+          </w:p>
+        </w:tc>
+        <w:tc>
+          <w:tcPr>
+            <w:tcW w:w="1853" w:type="dxa"/>
+          </w:tcPr>
+          <w:p>
+            <w:pPr>
+              <w:cnfStyle w:val="000000000000" w:firstRow="0" w:lastRow="0" w:firstColumn="0" w:lastColumn="0" w:oddVBand="0" w:evenVBand="0" w:oddHBand="0" w:evenHBand="0" w:firstRowFirstColumn="0" w:firstRowLastColumn="0" w:lastRowFirstColumn="0" w:lastRowLastColumn="0"/>
+              <w:rPr>
+                <w:rFonts w:ascii="Times New Roman" w:hAnsi="Times New Roman" w:cs="Times New Roman"/>
+              </w:rPr>
+            </w:pPr>
+            <w:r>
+              <w:rPr>
+                <w:rFonts w:ascii="Times New Roman" w:hAnsi="Times New Roman" w:cs="Times New Roman"/>
+              </w:rPr>
+              <w:t>Save Changes</w:t>
+            </w:r>
+          </w:p>
+        </w:tc>
+        <w:tc>
+          <w:tcPr>
+            <w:tcW w:w="2846" w:type="dxa"/>
+          </w:tcPr>
+          <w:p>
+            <w:pPr>
+              <w:cnfStyle w:val="000000000000" w:firstRow="0" w:lastRow="0" w:firstColumn="0" w:lastColumn="0" w:oddVBand="0" w:evenVBand="0" w:oddHBand="0" w:evenHBand="0" w:firstRowFirstColumn="0" w:firstRowLastColumn="0" w:lastRowFirstColumn="0" w:lastRowLastColumn="0"/>
+              <w:rPr>
+                <w:rFonts w:ascii="Times New Roman" w:hAnsi="Times New Roman" w:cs="Times New Roman"/>
+              </w:rPr>
+            </w:pPr>
+            <w:r>
+              <w:rPr>
+                <w:rFonts w:ascii="Times New Roman" w:hAnsi="Times New Roman" w:cs="Times New Roman"/>
+              </w:rPr>
+              <w:t>User on Settings page</w:t>
+            </w:r>
+          </w:p>
+        </w:tc>
+        <w:tc>
+          <w:tcPr>
+            <w:tcW w:w="2416" w:type="dxa"/>
+          </w:tcPr>
+          <w:p>
+            <w:pPr>
+              <w:cnfStyle w:val="000000000000" w:firstRow="0" w:lastRow="0" w:firstColumn="0" w:lastColumn="0" w:oddVBand="0" w:evenVBand="0" w:oddHBand="0" w:evenHBand="0" w:firstRowFirstColumn="0" w:firstRowLastColumn="0" w:lastRowFirstColumn="0" w:lastRowLastColumn="0"/>
+              <w:rPr>
+                <w:rFonts w:ascii="Times New Roman" w:hAnsi="Times New Roman" w:cs="Times New Roman"/>
+              </w:rPr>
+            </w:pPr>
+            <w:r>
+              <w:rPr>
+                <w:rFonts w:ascii="Times New Roman" w:hAnsi="Times New Roman" w:cs="Times New Roman"/>
+              </w:rPr>
+              <w:t>Make any changes → Click “Save”</w:t>
+            </w:r>
+          </w:p>
+        </w:tc>
+        <w:tc>
+          <w:tcPr>
+            <w:tcW w:w="2163" w:type="dxa"/>
+          </w:tcPr>
+          <w:p>
+            <w:pPr>
+              <w:cnfStyle w:val="000000000000" w:firstRow="0" w:lastRow="0" w:firstColumn="0" w:lastColumn="0" w:oddVBand="0" w:evenVBand="0" w:oddHBand="0" w:evenHBand="0" w:firstRowFirstColumn="0" w:firstRowLastColumn="0" w:lastRowFirstColumn="0" w:lastRowLastColumn="0"/>
+              <w:rPr>
+                <w:rFonts w:ascii="Times New Roman" w:hAnsi="Times New Roman" w:cs="Times New Roman"/>
+              </w:rPr>
+            </w:pPr>
+            <w:r>
+              <w:rPr>
+                <w:rFonts w:ascii="Times New Roman" w:hAnsi="Times New Roman" w:cs="Times New Roman"/>
+              </w:rPr>
+              <w:t>Change notifications to “Off”</w:t>
+            </w:r>
+          </w:p>
+        </w:tc>
+        <w:tc>
+          <w:tcPr>
+            <w:tcW w:w="1508" w:type="dxa"/>
+          </w:tcPr>
+          <w:p>
+            <w:pPr>
+              <w:cnfStyle w:val="000000000000" w:firstRow="0" w:lastRow="0" w:firstColumn="0" w:lastColumn="0" w:oddVBand="0" w:evenVBand="0" w:oddHBand="0" w:evenHBand="0" w:firstRowFirstColumn="0" w:firstRowLastColumn="0" w:lastRowFirstColumn="0" w:lastRowLastColumn="0"/>
+              <w:rPr>
+                <w:rFonts w:ascii="Times New Roman" w:hAnsi="Times New Roman" w:cs="Times New Roman"/>
+              </w:rPr>
+            </w:pPr>
+            <w:r>
+              <w:rPr>
+                <w:rFonts w:ascii="Times New Roman" w:hAnsi="Times New Roman" w:cs="Times New Roman"/>
+              </w:rPr>
+              <w:t>Changes saved successfully</w:t>
+            </w:r>
+          </w:p>
+        </w:tc>
+        <w:tc>
+          <w:tcPr>
+            <w:tcW w:w="1508" w:type="dxa"/>
+          </w:tcPr>
+          <w:p>
+            <w:pPr>
+              <w:cnfStyle w:val="000000000000" w:firstRow="0" w:lastRow="0" w:firstColumn="0" w:lastColumn="0" w:oddVBand="0" w:evenVBand="0" w:oddHBand="0" w:evenHBand="0" w:firstRowFirstColumn="0" w:firstRowLastColumn="0" w:lastRowFirstColumn="0" w:lastRowLastColumn="0"/>
+              <w:rPr>
+                <w:rFonts w:ascii="Times New Roman" w:hAnsi="Times New Roman" w:cs="Times New Roman"/>
+              </w:rPr>
+            </w:pPr>
+            <w:r>
+              <w:rPr>
+                <w:rFonts w:ascii="Times New Roman" w:hAnsi="Times New Roman" w:cs="Times New Roman"/>
+              </w:rPr>
+              <w:t>Changes saved successfully</w:t>
+            </w:r>
+          </w:p>
+        </w:tc>
+        <w:tc>
+          <w:tcPr>
+            <w:tcW w:w="857" w:type="dxa"/>
+          </w:tcPr>
+          <w:p>
+            <w:pPr>
+              <w:cnfStyle w:val="000000000000" w:firstRow="0" w:lastRow="0" w:firstColumn="0" w:lastColumn="0" w:oddVBand="0" w:evenVBand="0" w:oddHBand="0" w:evenHBand="0" w:firstRowFirstColumn="0" w:firstRowLastColumn="0" w:lastRowFirstColumn="0" w:lastRowLastColumn="0"/>
+              <w:rPr>
+                <w:rFonts w:ascii="Times New Roman" w:eastAsia="Times New Roman" w:hAnsi="Times New Roman" w:cs="Times New Roman"/>
+                <w:kern w:val="0"/>
+                <w:szCs w:val="24"/>
+                <w:lang w:eastAsia="en-GB"/>
+                <w14:ligatures w14:val="none"/>
+              </w:rPr>
+            </w:pPr>
+            <w:r>
+              <w:rPr>
+                <w:rFonts w:ascii="Times New Roman" w:eastAsia="Times New Roman" w:hAnsi="Times New Roman" w:cs="Times New Roman"/>
+                <w:kern w:val="0"/>
+                <w:szCs w:val="24"/>
+                <w:lang w:eastAsia="en-GB"/>
+                <w14:ligatures w14:val="none"/>
+              </w:rPr>
+              <w:t>Pass</w:t>
+            </w:r>
+          </w:p>
+        </w:tc>
+        <w:tc>
+          <w:tcPr>
+            <w:tcW w:w="1096" w:type="dxa"/>
+          </w:tcPr>
+          <w:p>
+            <w:pPr>
+              <w:cnfStyle w:val="000000000000" w:firstRow="0" w:lastRow="0" w:firstColumn="0" w:lastColumn="0" w:oddVBand="0" w:evenVBand="0" w:oddHBand="0" w:evenHBand="0" w:firstRowFirstColumn="0" w:firstRowLastColumn="0" w:lastRowFirstColumn="0" w:lastRowLastColumn="0"/>
+              <w:rPr>
+                <w:rFonts w:ascii="Times New Roman" w:eastAsia="Times New Roman" w:hAnsi="Times New Roman" w:cs="Times New Roman"/>
+                <w:kern w:val="0"/>
+                <w:szCs w:val="24"/>
+                <w:lang w:eastAsia="en-GB"/>
+                <w14:ligatures w14:val="none"/>
+              </w:rPr>
+            </w:pPr>
+            <w:r>
+              <w:rPr>
+                <w:rFonts w:ascii="Times New Roman" w:eastAsia="Times New Roman" w:hAnsi="Times New Roman" w:cs="Times New Roman"/>
+                <w:kern w:val="0"/>
+                <w:szCs w:val="24"/>
+                <w:lang w:eastAsia="en-GB"/>
+                <w14:ligatures w14:val="none"/>
+              </w:rPr>
+              <w:t>Zubayer</w:t>
+            </w:r>
+          </w:p>
+        </w:tc>
+        <w:tc>
+          <w:tcPr>
+            <w:tcW w:w="1123" w:type="dxa"/>
+          </w:tcPr>
+          <w:p>
+            <w:pPr>
+              <w:cnfStyle w:val="000000000000" w:firstRow="0" w:lastRow="0" w:firstColumn="0" w:lastColumn="0" w:oddVBand="0" w:evenVBand="0" w:oddHBand="0" w:evenHBand="0" w:firstRowFirstColumn="0" w:firstRowLastColumn="0" w:lastRowFirstColumn="0" w:lastRowLastColumn="0"/>
+              <w:rPr>
+                <w:rFonts w:ascii="Times New Roman" w:eastAsia="Times New Roman" w:hAnsi="Times New Roman" w:cs="Times New Roman"/>
+                <w:kern w:val="0"/>
+                <w:szCs w:val="24"/>
+                <w:lang w:eastAsia="en-GB"/>
+                <w14:ligatures w14:val="none"/>
+              </w:rPr>
+            </w:pPr>
+            <w:r>
+              <w:rPr>
+                <w:rFonts w:ascii="Times New Roman" w:eastAsia="Times New Roman" w:hAnsi="Times New Roman" w:cs="Times New Roman"/>
+                <w:kern w:val="0"/>
+                <w:szCs w:val="24"/>
+                <w:lang w:eastAsia="en-GB"/>
+                <w14:ligatures w14:val="none"/>
+              </w:rPr>
+              <w:t>12-Mar-2026</w:t>
+            </w:r>
+          </w:p>
+        </w:tc>
+        <w:tc>
+          <w:tcPr>
+            <w:tcW w:w="1163" w:type="dxa"/>
+          </w:tcPr>
+          <w:p>
+            <w:pPr>
+              <w:cnfStyle w:val="000000000000" w:firstRow="0" w:lastRow="0" w:firstColumn="0" w:lastColumn="0" w:oddVBand="0" w:evenVBand="0" w:oddHBand="0" w:evenHBand="0" w:firstRowFirstColumn="0" w:firstRowLastColumn="0" w:lastRowFirstColumn="0" w:lastRowLastColumn="0"/>
+              <w:rPr>
+                <w:rFonts w:ascii="Times New Roman" w:eastAsia="Times New Roman" w:hAnsi="Times New Roman" w:cs="Times New Roman"/>
+                <w:kern w:val="0"/>
+                <w:szCs w:val="24"/>
+                <w:lang w:eastAsia="en-GB"/>
+                <w14:ligatures w14:val="none"/>
+              </w:rPr>
+            </w:pPr>
+            <w:r>
+              <w:rPr>
+                <w:rFonts w:ascii="Times New Roman" w:eastAsia="Times New Roman" w:hAnsi="Times New Roman" w:cs="Times New Roman"/>
+                <w:kern w:val="0"/>
+                <w:szCs w:val="24"/>
+                <w:lang w:eastAsia="en-GB"/>
+                <w14:ligatures w14:val="none"/>
+              </w:rPr>
+              <w:t>Zubayer</w:t>
+            </w:r>
+          </w:p>
+        </w:tc>
+        <w:tc>
+          <w:tcPr>
+            <w:tcW w:w="1243" w:type="dxa"/>
+          </w:tcPr>
+          <w:p>
+            <w:pPr>
+              <w:cnfStyle w:val="000000000000" w:firstRow="0" w:lastRow="0" w:firstColumn="0" w:lastColumn="0" w:oddVBand="0" w:evenVBand="0" w:oddHBand="0" w:evenHBand="0" w:firstRowFirstColumn="0" w:firstRowLastColumn="0" w:lastRowFirstColumn="0" w:lastRowLastColumn="0"/>
+              <w:rPr>
+                <w:rFonts w:ascii="Times New Roman" w:eastAsia="Times New Roman" w:hAnsi="Times New Roman" w:cs="Times New Roman"/>
+                <w:kern w:val="0"/>
+                <w:szCs w:val="24"/>
+                <w:lang w:eastAsia="en-GB"/>
+                <w14:ligatures w14:val="none"/>
+              </w:rPr>
+            </w:pPr>
+            <w:r>
+              <w:rPr>
+                <w:rFonts w:ascii="Times New Roman" w:eastAsia="Times New Roman" w:hAnsi="Times New Roman" w:cs="Times New Roman"/>
+                <w:kern w:val="0"/>
+                <w:szCs w:val="24"/>
+                <w:lang w:eastAsia="en-GB"/>
+                <w14:ligatures w14:val="none"/>
+              </w:rPr>
+              <w:t>12-Mar-2026</w:t>
+            </w:r>
+          </w:p>
+        </w:tc>
+        <w:tc>
+          <w:tcPr>
+            <w:tcW w:w="9156" w:type="dxa"/>
+          </w:tcPr>
+          <w:p>
+            <w:pPr>
+              <w:jc w:val="center"/>
+              <w:cnfStyle w:val="000000000000" w:firstRow="0" w:lastRow="0" w:firstColumn="0" w:lastColumn="0" w:oddVBand="0" w:evenVBand="0" w:oddHBand="0" w:evenHBand="0" w:firstRowFirstColumn="0" w:firstRowLastColumn="0" w:lastRowFirstColumn="0" w:lastRowLastColumn="0"/>
+              <w:rPr>
+                <w:rFonts w:ascii="Times New Roman" w:eastAsia="Times New Roman" w:hAnsi="Times New Roman" w:cs="Times New Roman"/>
+                <w:noProof/>
+                <w:kern w:val="0"/>
+                <w:szCs w:val="24"/>
+                <w:lang w:eastAsia="en-GB"/>
+              </w:rPr>
+            </w:pPr>
+            <w:r>
+              <w:rPr>
+                <w:rFonts w:ascii="Times New Roman" w:eastAsia="Times New Roman" w:hAnsi="Times New Roman" w:cs="Times New Roman"/>
+                <w:noProof/>
+                <w:kern w:val="0"/>
+                <w:szCs w:val="24"/>
+                <w:lang w:eastAsia="en-GB"/>
+              </w:rPr>
+              <w:drawing>
+                <wp:inline distT="0" distB="0" distL="0" distR="0" wp14:anchorId="36BEB166" wp14:editId="5BBC994B">
+                  <wp:extent cx="2857500" cy="939800"/>
+                  <wp:effectExtent l="0" t="0" r="0" b="0"/>
+                  <wp:docPr id="1204947231" name="Picture 5" descr="A blue rectangle with white text&#10;&#10;AI-generated content may be incorrect."/>
+                  <wp:cNvGraphicFramePr>
+                    <a:graphicFrameLocks xmlns:a="http://schemas.openxmlformats.org/drawingml/2006/main" noChangeAspect="1"/>
+                  </wp:cNvGraphicFramePr>
+                  <a:graphic xmlns:a="http://schemas.openxmlformats.org/drawingml/2006/main">
+                    <a:graphicData uri="http://schemas.openxmlformats.org/drawingml/2006/picture">
+                      <pic:pic xmlns:pic="http://schemas.openxmlformats.org/drawingml/2006/picture">
+                        <pic:nvPicPr>
+                          <pic:cNvPr id="1204947231" name="Picture 5" descr="A blue rectangle with white text&#10;&#10;AI-generated content may be incorrect."/>
+                          <pic:cNvPicPr/>
+                        </pic:nvPicPr>
+                        <pic:blipFill>
+                          <a:blip r:embed="rId38">
+                            <a:extLst>
+                              <a:ext uri="{28A0092B-C50C-407E-A947-70E740481C1C}">
+                                <a14:useLocalDpi xmlns:a14="http://schemas.microsoft.com/office/drawing/2010/main" val="0"/>
+                              </a:ext>
+                            </a:extLst>
+                          </a:blip>
+                          <a:stretch>
+                            <a:fillRect/>
+                          </a:stretch>
+                        </pic:blipFill>
+                        <pic:spPr>
+                          <a:xfrm>
+                            <a:off x="0" y="0"/>
+                            <a:ext cx="2857500" cy="939800"/>
+                          </a:xfrm>
+                          <a:prstGeom prst="rect">
+                            <a:avLst/>
+                          </a:prstGeom>
+                        </pic:spPr>
+                      </pic:pic>
+                    </a:graphicData>
+                  </a:graphic>
+                </wp:inline>
+              </w:drawing>
+            </w:r>
+          </w:p>
+        </w:tc>
+      </w:tr>
+      <w:tr>
+        <w:tc>
+          <w:tcPr>
+            <w:cnfStyle w:val="001000000000" w:firstRow="0" w:lastRow="0" w:firstColumn="1" w:lastColumn="0" w:oddVBand="0" w:evenVBand="0" w:oddHBand="0" w:evenHBand="0" w:firstRowFirstColumn="0" w:firstRowLastColumn="0" w:lastRowFirstColumn="0" w:lastRowLastColumn="0"/>
+            <w:tcW w:w="912" w:type="dxa"/>
+          </w:tcPr>
+          <w:p>
+            <w:pPr>
+              <w:rPr>
+                <w:rFonts w:ascii="Times New Roman" w:hAnsi="Times New Roman" w:cs="Times New Roman"/>
+              </w:rPr>
+            </w:pPr>
+            <w:r>
+              <w:rPr>
+                <w:rFonts w:ascii="Times New Roman" w:hAnsi="Times New Roman" w:cs="Times New Roman"/>
+              </w:rPr>
+              <w:t>TC044</w:t>
+            </w:r>
+          </w:p>
+        </w:tc>
+        <w:tc>
+          <w:tcPr>
+            <w:tcW w:w="1853" w:type="dxa"/>
+          </w:tcPr>
+          <w:p>
+            <w:pPr>
+              <w:cnfStyle w:val="000000000000" w:firstRow="0" w:lastRow="0" w:firstColumn="0" w:lastColumn="0" w:oddVBand="0" w:evenVBand="0" w:oddHBand="0" w:evenHBand="0" w:firstRowFirstColumn="0" w:firstRowLastColumn="0" w:lastRowFirstColumn="0" w:lastRowLastColumn="0"/>
+              <w:rPr>
+                <w:rFonts w:ascii="Times New Roman" w:hAnsi="Times New Roman" w:cs="Times New Roman"/>
+              </w:rPr>
+            </w:pPr>
+            <w:r>
+              <w:rPr>
+                <w:rFonts w:ascii="Times New Roman" w:hAnsi="Times New Roman" w:cs="Times New Roman"/>
+              </w:rPr>
+              <w:t>Change Language</w:t>
+            </w:r>
+          </w:p>
+        </w:tc>
+        <w:tc>
+          <w:tcPr>
+            <w:tcW w:w="2846" w:type="dxa"/>
+          </w:tcPr>
+          <w:p>
+            <w:pPr>
+              <w:cnfStyle w:val="000000000000" w:firstRow="0" w:lastRow="0" w:firstColumn="0" w:lastColumn="0" w:oddVBand="0" w:evenVBand="0" w:oddHBand="0" w:evenHBand="0" w:firstRowFirstColumn="0" w:firstRowLastColumn="0" w:lastRowFirstColumn="0" w:lastRowLastColumn="0"/>
+              <w:rPr>
+                <w:rFonts w:ascii="Times New Roman" w:hAnsi="Times New Roman" w:cs="Times New Roman"/>
+              </w:rPr>
+            </w:pPr>
+            <w:r>
+              <w:rPr>
+                <w:rFonts w:ascii="Times New Roman" w:hAnsi="Times New Roman" w:cs="Times New Roman"/>
+              </w:rPr>
+              <w:t>User on Settings page</w:t>
+            </w:r>
+          </w:p>
+        </w:tc>
+        <w:tc>
+          <w:tcPr>
+            <w:tcW w:w="2416" w:type="dxa"/>
+          </w:tcPr>
+          <w:p>
+            <w:pPr>
+              <w:cnfStyle w:val="000000000000" w:firstRow="0" w:lastRow="0" w:firstColumn="0" w:lastColumn="0" w:oddVBand="0" w:evenVBand="0" w:oddHBand="0" w:evenHBand="0" w:firstRowFirstColumn="0" w:firstRowLastColumn="0" w:lastRowFirstColumn="0" w:lastRowLastColumn="0"/>
+              <w:rPr>
+                <w:rFonts w:ascii="Times New Roman" w:hAnsi="Times New Roman" w:cs="Times New Roman"/>
+              </w:rPr>
+            </w:pPr>
+            <w:r>
+              <w:rPr>
+                <w:rFonts w:ascii="Times New Roman" w:hAnsi="Times New Roman" w:cs="Times New Roman"/>
+              </w:rPr>
+              <w:t xml:space="preserve">Navigate to </w:t>
+            </w:r>
+            <w:r>
+              <w:rPr>
+                <w:rFonts w:ascii="Times New Roman" w:hAnsi="Times New Roman" w:cs="Times New Roman"/>
+              </w:rPr>
+              <w:t>Preferences</w:t>
+            </w:r>
+            <w:r>
+              <w:rPr>
+                <w:rFonts w:ascii="Times New Roman" w:hAnsi="Times New Roman" w:cs="Times New Roman"/>
+              </w:rPr>
+              <w:t xml:space="preserve"> → Select new language → Save</w:t>
+            </w:r>
+          </w:p>
+        </w:tc>
+        <w:tc>
+          <w:tcPr>
+            <w:tcW w:w="2163" w:type="dxa"/>
+          </w:tcPr>
+          <w:p>
+            <w:pPr>
+              <w:cnfStyle w:val="000000000000" w:firstRow="0" w:lastRow="0" w:firstColumn="0" w:lastColumn="0" w:oddVBand="0" w:evenVBand="0" w:oddHBand="0" w:evenHBand="0" w:firstRowFirstColumn="0" w:firstRowLastColumn="0" w:lastRowFirstColumn="0" w:lastRowLastColumn="0"/>
+              <w:rPr>
+                <w:rFonts w:ascii="Times New Roman" w:hAnsi="Times New Roman" w:cs="Times New Roman"/>
+              </w:rPr>
+            </w:pPr>
+            <w:r>
+              <w:rPr>
+                <w:rFonts w:ascii="Times New Roman" w:hAnsi="Times New Roman" w:cs="Times New Roman"/>
+              </w:rPr>
+              <w:t>Language: “Spanish”</w:t>
+            </w:r>
+          </w:p>
+        </w:tc>
+        <w:tc>
+          <w:tcPr>
+            <w:tcW w:w="1508" w:type="dxa"/>
+          </w:tcPr>
+          <w:tbl>
+            <w:tblPr>
+              <w:tblW w:w="0" w:type="auto"/>
+              <w:tblCellSpacing w:w="15" w:type="dxa"/>
+              <w:tblCellMar>
+                <w:top w:w="15" w:type="dxa"/>
+                <w:left w:w="15" w:type="dxa"/>
+                <w:bottom w:w="15" w:type="dxa"/>
+                <w:right w:w="15" w:type="dxa"/>
+              </w:tblCellMar>
+              <w:tblLook w:val="04A0" w:firstRow="1" w:lastRow="0" w:firstColumn="1" w:lastColumn="0" w:noHBand="0" w:noVBand="1"/>
+            </w:tblPr>
+            <w:tblGrid>
+              <w:gridCol w:w="110"/>
+            </w:tblGrid>
+            <w:tr>
+              <w:trPr>
+                <w:tblCellSpacing w:w="15" w:type="dxa"/>
+              </w:trPr>
+              <w:tc>
+                <w:tcPr>
+                  <w:tcW w:w="36" w:type="dxa"/>
+                  <w:vAlign w:val="center"/>
+                  <w:hideMark/>
+                </w:tcPr>
+                <w:p>
+                  <w:pPr>
+                    <w:rPr>
+                      <w:rFonts w:ascii="Times New Roman" w:hAnsi="Times New Roman" w:cs="Times New Roman"/>
+                    </w:rPr>
+                  </w:pPr>
+                </w:p>
+              </w:tc>
+            </w:tr>
+          </w:tbl>
+          <w:p>
+            <w:pPr>
+              <w:cnfStyle w:val="000000000000" w:firstRow="0" w:lastRow="0" w:firstColumn="0" w:lastColumn="0" w:oddVBand="0" w:evenVBand="0" w:oddHBand="0" w:evenHBand="0" w:firstRowFirstColumn="0" w:firstRowLastColumn="0" w:lastRowFirstColumn="0" w:lastRowLastColumn="0"/>
+              <w:rPr>
+                <w:rFonts w:ascii="Times New Roman" w:hAnsi="Times New Roman" w:cs="Times New Roman"/>
+                <w:vanish/>
+              </w:rPr>
+            </w:pPr>
+          </w:p>
+          <w:tbl>
+            <w:tblPr>
+              <w:tblW w:w="0" w:type="auto"/>
+              <w:tblCellSpacing w:w="15" w:type="dxa"/>
+              <w:tblCellMar>
+                <w:top w:w="15" w:type="dxa"/>
+                <w:left w:w="15" w:type="dxa"/>
+                <w:bottom w:w="15" w:type="dxa"/>
+                <w:right w:w="15" w:type="dxa"/>
+              </w:tblCellMar>
+              <w:tblLook w:val="04A0" w:firstRow="1" w:lastRow="0" w:firstColumn="1" w:lastColumn="0" w:noHBand="0" w:noVBand="1"/>
+            </w:tblPr>
+            <w:tblGrid>
+              <w:gridCol w:w="6188"/>
+            </w:tblGrid>
+            <w:tr>
+              <w:trPr>
+                <w:tblCellSpacing w:w="15" w:type="dxa"/>
+              </w:trPr>
+              <w:tc>
+                <w:tcPr>
+                  <w:tcW w:w="6128" w:type="dxa"/>
+                  <w:vAlign w:val="center"/>
+                  <w:hideMark/>
+                </w:tcPr>
+                <w:p>
+                  <w:pPr>
+                    <w:rPr>
+                      <w:rFonts w:ascii="Times New Roman" w:hAnsi="Times New Roman" w:cs="Times New Roman"/>
+                      <w:szCs w:val="24"/>
+                    </w:rPr>
+                  </w:pPr>
+                  <w:r>
+                    <w:rPr>
+                      <w:rFonts w:ascii="Times New Roman" w:hAnsi="Times New Roman" w:cs="Times New Roman"/>
+                    </w:rPr>
+                    <w:t>Language changed and interface displayed in selected language</w:t>
+                  </w:r>
+                </w:p>
+              </w:tc>
+            </w:tr>
+          </w:tbl>
+          <w:p>
+            <w:pPr>
+              <w:cnfStyle w:val="000000000000" w:firstRow="0" w:lastRow="0" w:firstColumn="0" w:lastColumn="0" w:oddVBand="0" w:evenVBand="0" w:oddHBand="0" w:evenHBand="0" w:firstRowFirstColumn="0" w:firstRowLastColumn="0" w:lastRowFirstColumn="0" w:lastRowLastColumn="0"/>
+              <w:rPr>
+                <w:rFonts w:ascii="Times New Roman" w:hAnsi="Times New Roman" w:cs="Times New Roman"/>
+              </w:rPr>
+            </w:pPr>
+          </w:p>
+        </w:tc>
+        <w:tc>
+          <w:tcPr>
+            <w:tcW w:w="1508" w:type="dxa"/>
+          </w:tcPr>
+          <w:tbl>
+            <w:tblPr>
+              <w:tblW w:w="0" w:type="auto"/>
+              <w:tblCellSpacing w:w="15" w:type="dxa"/>
+              <w:tblCellMar>
+                <w:top w:w="15" w:type="dxa"/>
+                <w:left w:w="15" w:type="dxa"/>
+                <w:bottom w:w="15" w:type="dxa"/>
+                <w:right w:w="15" w:type="dxa"/>
+              </w:tblCellMar>
+              <w:tblLook w:val="04A0" w:firstRow="1" w:lastRow="0" w:firstColumn="1" w:lastColumn="0" w:noHBand="0" w:noVBand="1"/>
+            </w:tblPr>
+            <w:tblGrid>
+              <w:gridCol w:w="110"/>
+            </w:tblGrid>
+            <w:tr>
+              <w:trPr>
+                <w:tblCellSpacing w:w="15" w:type="dxa"/>
+              </w:trPr>
+              <w:tc>
+                <w:tcPr>
+                  <w:tcW w:w="36" w:type="dxa"/>
+                  <w:vAlign w:val="center"/>
+                  <w:hideMark/>
+                </w:tcPr>
+                <w:p>
+                  <w:pPr>
+                    <w:rPr>
+                      <w:rFonts w:ascii="Times New Roman" w:hAnsi="Times New Roman" w:cs="Times New Roman"/>
+                    </w:rPr>
+                  </w:pPr>
+                </w:p>
+              </w:tc>
+            </w:tr>
+          </w:tbl>
+          <w:p>
+            <w:pPr>
+              <w:cnfStyle w:val="000000000000" w:firstRow="0" w:lastRow="0" w:firstColumn="0" w:lastColumn="0" w:oddVBand="0" w:evenVBand="0" w:oddHBand="0" w:evenHBand="0" w:firstRowFirstColumn="0" w:firstRowLastColumn="0" w:lastRowFirstColumn="0" w:lastRowLastColumn="0"/>
+              <w:rPr>
+                <w:rFonts w:ascii="Times New Roman" w:hAnsi="Times New Roman" w:cs="Times New Roman"/>
+                <w:vanish/>
+              </w:rPr>
+            </w:pPr>
+          </w:p>
+          <w:tbl>
+            <w:tblPr>
+              <w:tblW w:w="0" w:type="auto"/>
+              <w:tblCellSpacing w:w="15" w:type="dxa"/>
+              <w:tblCellMar>
+                <w:top w:w="15" w:type="dxa"/>
+                <w:left w:w="15" w:type="dxa"/>
+                <w:bottom w:w="15" w:type="dxa"/>
+                <w:right w:w="15" w:type="dxa"/>
+              </w:tblCellMar>
+              <w:tblLook w:val="04A0" w:firstRow="1" w:lastRow="0" w:firstColumn="1" w:lastColumn="0" w:noHBand="0" w:noVBand="1"/>
+            </w:tblPr>
+            <w:tblGrid>
+              <w:gridCol w:w="6188"/>
+            </w:tblGrid>
+            <w:tr>
+              <w:trPr>
+                <w:tblCellSpacing w:w="15" w:type="dxa"/>
+              </w:trPr>
+              <w:tc>
+                <w:tcPr>
+                  <w:tcW w:w="6128" w:type="dxa"/>
+                  <w:vAlign w:val="center"/>
+                  <w:hideMark/>
+                </w:tcPr>
+                <w:p>
+                  <w:pPr>
+                    <w:rPr>
+                      <w:rFonts w:ascii="Times New Roman" w:hAnsi="Times New Roman" w:cs="Times New Roman"/>
+                      <w:szCs w:val="24"/>
+                    </w:rPr>
+                  </w:pPr>
+                  <w:r>
+                    <w:rPr>
+                      <w:rFonts w:ascii="Times New Roman" w:hAnsi="Times New Roman" w:cs="Times New Roman"/>
+                    </w:rPr>
+                    <w:t>Language changed and interface displayed in selected language</w:t>
+                  </w:r>
+                </w:p>
+              </w:tc>
+            </w:tr>
+          </w:tbl>
+          <w:p>
+            <w:pPr>
+              <w:cnfStyle w:val="000000000000" w:firstRow="0" w:lastRow="0" w:firstColumn="0" w:lastColumn="0" w:oddVBand="0" w:evenVBand="0" w:oddHBand="0" w:evenHBand="0" w:firstRowFirstColumn="0" w:firstRowLastColumn="0" w:lastRowFirstColumn="0" w:lastRowLastColumn="0"/>
+              <w:rPr>
+                <w:rFonts w:ascii="Times New Roman" w:hAnsi="Times New Roman" w:cs="Times New Roman"/>
+              </w:rPr>
+            </w:pPr>
+          </w:p>
+        </w:tc>
+        <w:tc>
+          <w:tcPr>
+            <w:tcW w:w="857" w:type="dxa"/>
+          </w:tcPr>
+          <w:p>
+            <w:pPr>
+              <w:cnfStyle w:val="000000000000" w:firstRow="0" w:lastRow="0" w:firstColumn="0" w:lastColumn="0" w:oddVBand="0" w:evenVBand="0" w:oddHBand="0" w:evenHBand="0" w:firstRowFirstColumn="0" w:firstRowLastColumn="0" w:lastRowFirstColumn="0" w:lastRowLastColumn="0"/>
+              <w:rPr>
+                <w:rFonts w:ascii="Times New Roman" w:eastAsia="Times New Roman" w:hAnsi="Times New Roman" w:cs="Times New Roman"/>
+                <w:kern w:val="0"/>
+                <w:szCs w:val="24"/>
+                <w:lang w:eastAsia="en-GB"/>
+                <w14:ligatures w14:val="none"/>
+              </w:rPr>
+            </w:pPr>
+            <w:r>
+              <w:rPr>
+                <w:rFonts w:ascii="Times New Roman" w:eastAsia="Times New Roman" w:hAnsi="Times New Roman" w:cs="Times New Roman"/>
+                <w:kern w:val="0"/>
+                <w:szCs w:val="24"/>
+                <w:lang w:eastAsia="en-GB"/>
+                <w14:ligatures w14:val="none"/>
+              </w:rPr>
+              <w:t>Pass</w:t>
+            </w:r>
+          </w:p>
+        </w:tc>
+        <w:tc>
+          <w:tcPr>
+            <w:tcW w:w="1096" w:type="dxa"/>
+          </w:tcPr>
+          <w:p>
+            <w:pPr>
+              <w:cnfStyle w:val="000000000000" w:firstRow="0" w:lastRow="0" w:firstColumn="0" w:lastColumn="0" w:oddVBand="0" w:evenVBand="0" w:oddHBand="0" w:evenHBand="0" w:firstRowFirstColumn="0" w:firstRowLastColumn="0" w:lastRowFirstColumn="0" w:lastRowLastColumn="0"/>
+              <w:rPr>
+                <w:rFonts w:ascii="Times New Roman" w:eastAsia="Times New Roman" w:hAnsi="Times New Roman" w:cs="Times New Roman"/>
+                <w:kern w:val="0"/>
+                <w:szCs w:val="24"/>
+                <w:lang w:eastAsia="en-GB"/>
+                <w14:ligatures w14:val="none"/>
+              </w:rPr>
+            </w:pPr>
+            <w:r>
+              <w:rPr>
+                <w:rFonts w:ascii="Times New Roman" w:eastAsia="Times New Roman" w:hAnsi="Times New Roman" w:cs="Times New Roman"/>
+                <w:kern w:val="0"/>
+                <w:szCs w:val="24"/>
+                <w:lang w:eastAsia="en-GB"/>
+                <w14:ligatures w14:val="none"/>
+              </w:rPr>
+              <w:t>Zubayer</w:t>
+            </w:r>
+          </w:p>
+        </w:tc>
+        <w:tc>
+          <w:tcPr>
+            <w:tcW w:w="1123" w:type="dxa"/>
+          </w:tcPr>
+          <w:p>
+            <w:pPr>
+              <w:cnfStyle w:val="000000000000" w:firstRow="0" w:lastRow="0" w:firstColumn="0" w:lastColumn="0" w:oddVBand="0" w:evenVBand="0" w:oddHBand="0" w:evenHBand="0" w:firstRowFirstColumn="0" w:firstRowLastColumn="0" w:lastRowFirstColumn="0" w:lastRowLastColumn="0"/>
+              <w:rPr>
+                <w:rFonts w:ascii="Times New Roman" w:eastAsia="Times New Roman" w:hAnsi="Times New Roman" w:cs="Times New Roman"/>
+                <w:kern w:val="0"/>
+                <w:szCs w:val="24"/>
+                <w:lang w:eastAsia="en-GB"/>
+                <w14:ligatures w14:val="none"/>
+              </w:rPr>
+            </w:pPr>
+            <w:r>
+              <w:rPr>
+                <w:rFonts w:ascii="Times New Roman" w:eastAsia="Times New Roman" w:hAnsi="Times New Roman" w:cs="Times New Roman"/>
+                <w:kern w:val="0"/>
+                <w:szCs w:val="24"/>
+                <w:lang w:eastAsia="en-GB"/>
+                <w14:ligatures w14:val="none"/>
+              </w:rPr>
+              <w:t>12-Mar-2026</w:t>
+            </w:r>
+          </w:p>
+        </w:tc>
+        <w:tc>
+          <w:tcPr>
+            <w:tcW w:w="1163" w:type="dxa"/>
+          </w:tcPr>
+          <w:p>
+            <w:pPr>
+              <w:cnfStyle w:val="000000000000" w:firstRow="0" w:lastRow="0" w:firstColumn="0" w:lastColumn="0" w:oddVBand="0" w:evenVBand="0" w:oddHBand="0" w:evenHBand="0" w:firstRowFirstColumn="0" w:firstRowLastColumn="0" w:lastRowFirstColumn="0" w:lastRowLastColumn="0"/>
+              <w:rPr>
+                <w:rFonts w:ascii="Times New Roman" w:eastAsia="Times New Roman" w:hAnsi="Times New Roman" w:cs="Times New Roman"/>
+                <w:kern w:val="0"/>
+                <w:szCs w:val="24"/>
+                <w:lang w:eastAsia="en-GB"/>
+                <w14:ligatures w14:val="none"/>
+              </w:rPr>
+            </w:pPr>
+            <w:r>
+              <w:rPr>
+                <w:rFonts w:ascii="Times New Roman" w:eastAsia="Times New Roman" w:hAnsi="Times New Roman" w:cs="Times New Roman"/>
+                <w:kern w:val="0"/>
+                <w:szCs w:val="24"/>
+                <w:lang w:eastAsia="en-GB"/>
+                <w14:ligatures w14:val="none"/>
+              </w:rPr>
+              <w:t>Zubayer</w:t>
+            </w:r>
+          </w:p>
+        </w:tc>
+        <w:tc>
+          <w:tcPr>
+            <w:tcW w:w="1243" w:type="dxa"/>
+          </w:tcPr>
+          <w:p>
+            <w:pPr>
+              <w:cnfStyle w:val="000000000000" w:firstRow="0" w:lastRow="0" w:firstColumn="0" w:lastColumn="0" w:oddVBand="0" w:evenVBand="0" w:oddHBand="0" w:evenHBand="0" w:firstRowFirstColumn="0" w:firstRowLastColumn="0" w:lastRowFirstColumn="0" w:lastRowLastColumn="0"/>
+              <w:rPr>
+                <w:rFonts w:ascii="Times New Roman" w:eastAsia="Times New Roman" w:hAnsi="Times New Roman" w:cs="Times New Roman"/>
+                <w:kern w:val="0"/>
+                <w:szCs w:val="24"/>
+                <w:lang w:eastAsia="en-GB"/>
+                <w14:ligatures w14:val="none"/>
+              </w:rPr>
+            </w:pPr>
+            <w:r>
+              <w:rPr>
+                <w:rFonts w:ascii="Times New Roman" w:eastAsia="Times New Roman" w:hAnsi="Times New Roman" w:cs="Times New Roman"/>
+                <w:kern w:val="0"/>
+                <w:szCs w:val="24"/>
+                <w:lang w:eastAsia="en-GB"/>
+                <w14:ligatures w14:val="none"/>
+              </w:rPr>
+              <w:t>12-Mar-2026</w:t>
+            </w:r>
+          </w:p>
+        </w:tc>
+        <w:tc>
+          <w:tcPr>
+            <w:tcW w:w="9156" w:type="dxa"/>
+          </w:tcPr>
+          <w:p>
+            <w:pPr>
+              <w:jc w:val="center"/>
+              <w:cnfStyle w:val="000000000000" w:firstRow="0" w:lastRow="0" w:firstColumn="0" w:lastColumn="0" w:oddVBand="0" w:evenVBand="0" w:oddHBand="0" w:evenHBand="0" w:firstRowFirstColumn="0" w:firstRowLastColumn="0" w:lastRowFirstColumn="0" w:lastRowLastColumn="0"/>
+              <w:rPr>
+                <w:rFonts w:ascii="Times New Roman" w:eastAsia="Times New Roman" w:hAnsi="Times New Roman" w:cs="Times New Roman"/>
+                <w:noProof/>
+                <w:kern w:val="0"/>
+                <w:szCs w:val="24"/>
+                <w:lang w:eastAsia="en-GB"/>
+              </w:rPr>
+            </w:pPr>
+            <w:r>
+              <w:rPr>
+                <w:rFonts w:ascii="Times New Roman" w:eastAsia="Times New Roman" w:hAnsi="Times New Roman" w:cs="Times New Roman"/>
+                <w:noProof/>
+                <w:kern w:val="0"/>
+                <w:szCs w:val="24"/>
+                <w:lang w:eastAsia="en-GB"/>
+              </w:rPr>
+              <w:drawing>
+                <wp:inline distT="0" distB="0" distL="0" distR="0" wp14:anchorId="55918EED" wp14:editId="2C2A4B3B">
+                  <wp:extent cx="2095500" cy="1790700"/>
+                  <wp:effectExtent l="0" t="0" r="0" b="0"/>
+                  <wp:docPr id="198861493" name="Picture 6" descr="A screenshot of a computer&#10;&#10;AI-generated content may be incorrect."/>
+                  <wp:cNvGraphicFramePr>
+                    <a:graphicFrameLocks xmlns:a="http://schemas.openxmlformats.org/drawingml/2006/main" noChangeAspect="1"/>
+                  </wp:cNvGraphicFramePr>
+                  <a:graphic xmlns:a="http://schemas.openxmlformats.org/drawingml/2006/main">
+                    <a:graphicData uri="http://schemas.openxmlformats.org/drawingml/2006/picture">
+                      <pic:pic xmlns:pic="http://schemas.openxmlformats.org/drawingml/2006/picture">
+                        <pic:nvPicPr>
+                          <pic:cNvPr id="198861493" name="Picture 6" descr="A screenshot of a computer&#10;&#10;AI-generated content may be incorrect."/>
+                          <pic:cNvPicPr/>
+                        </pic:nvPicPr>
+                        <pic:blipFill>
+                          <a:blip r:embed="rId39">
+                            <a:extLst>
+                              <a:ext uri="{28A0092B-C50C-407E-A947-70E740481C1C}">
+                                <a14:useLocalDpi xmlns:a14="http://schemas.microsoft.com/office/drawing/2010/main" val="0"/>
+                              </a:ext>
+                            </a:extLst>
+                          </a:blip>
+                          <a:stretch>
+                            <a:fillRect/>
+                          </a:stretch>
+                        </pic:blipFill>
+                        <pic:spPr>
+                          <a:xfrm>
+                            <a:off x="0" y="0"/>
+                            <a:ext cx="2095500" cy="1790700"/>
                           </a:xfrm>
                           <a:prstGeom prst="rect">
                             <a:avLst/>

</xml_diff>